<commit_message>
Docs: SysPulse is Linux-only (Windows port dropped)
Co-Authored-By: Claude Opus 5.5 <noreply@anthropic.com>
</commit_message>
<xml_diff>
--- a/docs/word/SysPulse Architecture Guide.docx
+++ b/docs/word/SysPulse Architecture Guide.docx
@@ -602,7 +602,7 @@
             <w:b/>
             <w:sz w:val="22"/>
           </w:rPr>
-          <w:t xml:space="preserve">16. Portability (Windows port)</w:t>
+          <w:t xml:space="preserve">16. Platform scope</w:t>
         </w:r>
       </w:hyperlink>
     </w:p>
@@ -648,7 +648,7 @@
         <w:keepNext/>
       </w:pPr>
       <w:r>
-        <w:t>SysPulse is an open-source, all-in-one system utility for Ubuntu 22.04+. It combines the following, with a Windows port planned:</w:t>
+        <w:t>SysPulse is an open-source, all-in-one system utility for Ubuntu 22.04+. It is a Linux-only project. It combines the following:</w:t>
       </w:r>
     </w:p>
     <w:p>
@@ -1005,14 +1005,14 @@
                 <w:b/>
                 <w:sz w:val="19"/>
               </w:rPr>
-              <w:t>Portable</w:t>
+              <w:t>Maintainable</w:t>
             </w:r>
             <w:r>
               <w:rPr>
                 <w:b/>
                 <w:sz w:val="19"/>
               </w:rPr>
-              <w:t xml:space="preserve"> — Windows later</w:t>
+              <w:t xml:space="preserve"> — Linux first</w:t>
             </w:r>
           </w:p>
         </w:tc>
@@ -1035,7 +1035,7 @@
               <w:rPr>
                 <w:sz w:val="19"/>
               </w:rPr>
-              <w:t>OS logic lives in one Rust library behind small interfaces; the UI and command layer are shared</w:t>
+              <w:t>OS logic lives in one Rust library behind small interfaces; the UI and command layer only call that library</w:t>
             </w:r>
           </w:p>
         </w:tc>
@@ -1431,7 +1431,7 @@
               <w:rPr>
                 <w:sz w:val="19"/>
               </w:rPr>
-              <w:t>Uses the OS webview (WebKitGTK): ~40 MB RAM vs 300 MB+ for Electron; Linux + Windows</w:t>
+              <w:t>Uses the OS webview (WebKitGTK): ~40 MB RAM vs 300 MB+ for Electron</w:t>
             </w:r>
           </w:p>
         </w:tc>
@@ -2452,7 +2452,7 @@
               <w:rPr>
                 <w:sz w:val="19"/>
               </w:rPr>
-              <w:t>freedesktop Trash spec (and Windows Recycle Bin later)</w:t>
+              <w:t>freedesktop Trash spec (files can be restored from the Trash)</w:t>
             </w:r>
           </w:p>
         </w:tc>
@@ -2906,7 +2906,7 @@
               <w:rPr>
                 <w:sz w:val="19"/>
               </w:rPr>
-              <w:t>iperf-style tests between two SysPulse instances; Windows-portable</w:t>
+              <w:t>iperf-style tests between two SysPulse instances</w:t>
             </w:r>
           </w:p>
         </w:tc>
@@ -18576,927 +18576,176 @@
         <w:pStyle w:val="Heading1"/>
       </w:pPr>
       <w:r>
-        <w:t>16. Portability (Windows port)</w:t>
+        <w:t>16. Platform scope</w:t>
       </w:r>
       <w:bookmarkEnd w:id="29"/>
     </w:p>
-    <w:tbl>
-      <w:tblPr>
-        <w:tblW w:type="auto" w:w="0"/>
-        <w:jc w:val="center"/>
-        <w:tblLook w:firstColumn="1" w:firstRow="1" w:lastColumn="0" w:lastRow="0" w:noHBand="0" w:noVBand="1" w:val="04A0"/>
-        <w:tblBorders>
-          <w:top w:val="single" w:sz="4" w:space="0" w:color="D0D7DE"/>
-          <w:left w:val="single" w:sz="4" w:space="0" w:color="D0D7DE"/>
-          <w:bottom w:val="single" w:sz="4" w:space="0" w:color="D0D7DE"/>
-          <w:right w:val="single" w:sz="4" w:space="0" w:color="D0D7DE"/>
-          <w:insideH w:val="single" w:sz="4" w:space="0" w:color="D0D7DE"/>
-          <w:insideV w:val="single" w:sz="4" w:space="0" w:color="D0D7DE"/>
-        </w:tblBorders>
-      </w:tblPr>
-      <w:tblGrid>
-        <w:gridCol w:w="3213"/>
-        <w:gridCol w:w="3213"/>
-        <w:gridCol w:w="3213"/>
-      </w:tblGrid>
-      <w:tr>
-        <w:trPr>
-          <w:tblHeader w:val="true"/>
-        </w:trPr>
-        <w:tc>
-          <w:tcPr>
-            <w:tcW w:type="dxa" w:w="1817"/>
-            <w:tcMar>
-              <w:top w:w="60" w:type="dxa"/>
-              <w:bottom w:w="60" w:type="dxa"/>
-              <w:start w:w="100" w:type="dxa"/>
-              <w:end w:w="100" w:type="dxa"/>
-            </w:tcMar>
-            <w:shd w:val="clear" w:color="auto" w:fill="1F6FEB"/>
-          </w:tcPr>
-          <w:p>
-            <w:pPr>
-              <w:spacing w:after="0" w:line="252" w:lineRule="auto"/>
-            </w:pPr>
-            <w:r>
-              <w:rPr>
-                <w:b/>
-                <w:color w:val="FFFFFF"/>
-                <w:sz w:val="19"/>
-              </w:rPr>
-              <w:t>Area</w:t>
-            </w:r>
-          </w:p>
-        </w:tc>
-        <w:tc>
-          <w:tcPr>
-            <w:tcW w:type="dxa" w:w="3081"/>
-            <w:tcMar>
-              <w:top w:w="60" w:type="dxa"/>
-              <w:bottom w:w="60" w:type="dxa"/>
-              <w:start w:w="100" w:type="dxa"/>
-              <w:end w:w="100" w:type="dxa"/>
-            </w:tcMar>
-            <w:shd w:val="clear" w:color="auto" w:fill="1F6FEB"/>
-          </w:tcPr>
-          <w:p>
-            <w:pPr>
-              <w:spacing w:after="0" w:line="252" w:lineRule="auto"/>
-            </w:pPr>
-            <w:r>
-              <w:rPr>
-                <w:b/>
-                <w:color w:val="FFFFFF"/>
-                <w:sz w:val="19"/>
-              </w:rPr>
-              <w:t>Linux today</w:t>
-            </w:r>
-          </w:p>
-        </w:tc>
-        <w:tc>
-          <w:tcPr>
-            <w:tcW w:type="dxa" w:w="4740"/>
-            <w:tcMar>
-              <w:top w:w="60" w:type="dxa"/>
-              <w:bottom w:w="60" w:type="dxa"/>
-              <w:start w:w="100" w:type="dxa"/>
-              <w:end w:w="100" w:type="dxa"/>
-            </w:tcMar>
-            <w:shd w:val="clear" w:color="auto" w:fill="1F6FEB"/>
-          </w:tcPr>
-          <w:p>
-            <w:pPr>
-              <w:spacing w:after="0" w:line="252" w:lineRule="auto"/>
-            </w:pPr>
-            <w:r>
-              <w:rPr>
-                <w:b/>
-                <w:color w:val="FFFFFF"/>
-                <w:sz w:val="19"/>
-              </w:rPr>
-              <w:t>Windows plan</w:t>
-            </w:r>
-          </w:p>
-        </w:tc>
-      </w:tr>
-      <w:tr>
-        <w:tc>
-          <w:tcPr>
-            <w:tcW w:type="dxa" w:w="1817"/>
-            <w:tcMar>
-              <w:top w:w="60" w:type="dxa"/>
-              <w:bottom w:w="60" w:type="dxa"/>
-              <w:start w:w="100" w:type="dxa"/>
-              <w:end w:w="100" w:type="dxa"/>
-            </w:tcMar>
-          </w:tcPr>
-          <w:p>
-            <w:pPr>
-              <w:spacing w:after="0" w:line="252" w:lineRule="auto"/>
-            </w:pPr>
-            <w:r>
-              <w:rPr>
-                <w:b/>
-                <w:sz w:val="19"/>
-              </w:rPr>
-              <w:t>Metrics</w:t>
-            </w:r>
-          </w:p>
-        </w:tc>
-        <w:tc>
-          <w:tcPr>
-            <w:tcW w:type="dxa" w:w="3081"/>
-            <w:tcMar>
-              <w:top w:w="60" w:type="dxa"/>
-              <w:bottom w:w="60" w:type="dxa"/>
-              <w:start w:w="100" w:type="dxa"/>
-              <w:end w:w="100" w:type="dxa"/>
-            </w:tcMar>
-          </w:tcPr>
-          <w:p>
-            <w:pPr>
-              <w:spacing w:after="0" w:line="252" w:lineRule="auto"/>
-            </w:pPr>
-            <w:r>
-              <w:rPr>
-                <w:rFonts w:ascii="Consolas" w:hAnsi="Consolas"/>
-                <w:sz w:val="17"/>
-                <w:shd w:val="clear" w:fill="EEF1F5"/>
-              </w:rPr>
-              <w:t>sysinfo</w:t>
-            </w:r>
-            <w:r>
-              <w:rPr>
-                <w:sz w:val="19"/>
-              </w:rPr>
-              <w:t xml:space="preserve"> + procfs</w:t>
-            </w:r>
-          </w:p>
-        </w:tc>
-        <w:tc>
-          <w:tcPr>
-            <w:tcW w:type="dxa" w:w="4740"/>
-            <w:tcMar>
-              <w:top w:w="60" w:type="dxa"/>
-              <w:bottom w:w="60" w:type="dxa"/>
-              <w:start w:w="100" w:type="dxa"/>
-              <w:end w:w="100" w:type="dxa"/>
-            </w:tcMar>
-          </w:tcPr>
-          <w:p>
-            <w:pPr>
-              <w:spacing w:after="0" w:line="252" w:lineRule="auto"/>
-            </w:pPr>
-            <w:r>
-              <w:rPr>
-                <w:rFonts w:ascii="Consolas" w:hAnsi="Consolas"/>
-                <w:sz w:val="17"/>
-                <w:shd w:val="clear" w:fill="EEF1F5"/>
-              </w:rPr>
-              <w:t>sysinfo</w:t>
-            </w:r>
-            <w:r>
-              <w:rPr>
-                <w:sz w:val="19"/>
-              </w:rPr>
-              <w:t xml:space="preserve"> + PDH (shared code)</w:t>
-            </w:r>
-          </w:p>
-        </w:tc>
-      </w:tr>
-      <w:tr>
-        <w:tc>
-          <w:tcPr>
-            <w:tcW w:type="dxa" w:w="1817"/>
-            <w:tcMar>
-              <w:top w:w="60" w:type="dxa"/>
-              <w:bottom w:w="60" w:type="dxa"/>
-              <w:start w:w="100" w:type="dxa"/>
-              <w:end w:w="100" w:type="dxa"/>
-            </w:tcMar>
-            <w:shd w:val="clear" w:color="auto" w:fill="F3F6FB"/>
-          </w:tcPr>
-          <w:p>
-            <w:pPr>
-              <w:spacing w:after="0" w:line="252" w:lineRule="auto"/>
-            </w:pPr>
-            <w:r>
-              <w:rPr>
-                <w:b/>
-                <w:sz w:val="19"/>
-              </w:rPr>
-              <w:t>GPU</w:t>
-            </w:r>
-          </w:p>
-        </w:tc>
-        <w:tc>
-          <w:tcPr>
-            <w:tcW w:type="dxa" w:w="3081"/>
-            <w:tcMar>
-              <w:top w:w="60" w:type="dxa"/>
-              <w:bottom w:w="60" w:type="dxa"/>
-              <w:start w:w="100" w:type="dxa"/>
-              <w:end w:w="100" w:type="dxa"/>
-            </w:tcMar>
-            <w:shd w:val="clear" w:color="auto" w:fill="F3F6FB"/>
-          </w:tcPr>
-          <w:p>
-            <w:pPr>
-              <w:spacing w:after="0" w:line="252" w:lineRule="auto"/>
-            </w:pPr>
-            <w:r>
-              <w:rPr>
-                <w:sz w:val="19"/>
-              </w:rPr>
-              <w:t>NVML + DRM sysfs</w:t>
-            </w:r>
-          </w:p>
-        </w:tc>
-        <w:tc>
-          <w:tcPr>
-            <w:tcW w:type="dxa" w:w="4740"/>
-            <w:tcMar>
-              <w:top w:w="60" w:type="dxa"/>
-              <w:bottom w:w="60" w:type="dxa"/>
-              <w:start w:w="100" w:type="dxa"/>
-              <w:end w:w="100" w:type="dxa"/>
-            </w:tcMar>
-            <w:shd w:val="clear" w:color="auto" w:fill="F3F6FB"/>
-          </w:tcPr>
-          <w:p>
-            <w:pPr>
-              <w:spacing w:after="0" w:line="252" w:lineRule="auto"/>
-            </w:pPr>
-            <w:r>
-              <w:rPr>
-                <w:sz w:val="19"/>
-              </w:rPr>
-              <w:t>NVML + DXGI / D3DKMT</w:t>
-            </w:r>
-          </w:p>
-        </w:tc>
-      </w:tr>
-      <w:tr>
-        <w:tc>
-          <w:tcPr>
-            <w:tcW w:type="dxa" w:w="1817"/>
-            <w:tcMar>
-              <w:top w:w="60" w:type="dxa"/>
-              <w:bottom w:w="60" w:type="dxa"/>
-              <w:start w:w="100" w:type="dxa"/>
-              <w:end w:w="100" w:type="dxa"/>
-            </w:tcMar>
-          </w:tcPr>
-          <w:p>
-            <w:pPr>
-              <w:spacing w:after="0" w:line="252" w:lineRule="auto"/>
-            </w:pPr>
-            <w:r>
-              <w:rPr>
-                <w:b/>
-                <w:sz w:val="19"/>
-              </w:rPr>
-              <w:t>Hardware</w:t>
-            </w:r>
-          </w:p>
-        </w:tc>
-        <w:tc>
-          <w:tcPr>
-            <w:tcW w:type="dxa" w:w="3081"/>
-            <w:tcMar>
-              <w:top w:w="60" w:type="dxa"/>
-              <w:bottom w:w="60" w:type="dxa"/>
-              <w:start w:w="100" w:type="dxa"/>
-              <w:end w:w="100" w:type="dxa"/>
-            </w:tcMar>
-          </w:tcPr>
-          <w:p>
-            <w:pPr>
-              <w:spacing w:after="0" w:line="252" w:lineRule="auto"/>
-            </w:pPr>
-            <w:r>
-              <w:rPr>
-                <w:sz w:val="19"/>
-              </w:rPr>
-              <w:t>sysfs</w:t>
-            </w:r>
-          </w:p>
-        </w:tc>
-        <w:tc>
-          <w:tcPr>
-            <w:tcW w:type="dxa" w:w="4740"/>
-            <w:tcMar>
-              <w:top w:w="60" w:type="dxa"/>
-              <w:bottom w:w="60" w:type="dxa"/>
-              <w:start w:w="100" w:type="dxa"/>
-              <w:end w:w="100" w:type="dxa"/>
-            </w:tcMar>
-          </w:tcPr>
-          <w:p>
-            <w:pPr>
-              <w:spacing w:after="0" w:line="252" w:lineRule="auto"/>
-            </w:pPr>
-            <w:r>
-              <w:rPr>
-                <w:sz w:val="19"/>
-              </w:rPr>
-              <w:t>WMI</w:t>
-            </w:r>
-          </w:p>
-        </w:tc>
-      </w:tr>
-      <w:tr>
-        <w:tc>
-          <w:tcPr>
-            <w:tcW w:type="dxa" w:w="1817"/>
-            <w:tcMar>
-              <w:top w:w="60" w:type="dxa"/>
-              <w:bottom w:w="60" w:type="dxa"/>
-              <w:start w:w="100" w:type="dxa"/>
-              <w:end w:w="100" w:type="dxa"/>
-            </w:tcMar>
-            <w:shd w:val="clear" w:color="auto" w:fill="F3F6FB"/>
-          </w:tcPr>
-          <w:p>
-            <w:pPr>
-              <w:spacing w:after="0" w:line="252" w:lineRule="auto"/>
-            </w:pPr>
-            <w:r>
-              <w:rPr>
-                <w:b/>
-                <w:sz w:val="19"/>
-              </w:rPr>
-              <w:t>Processes</w:t>
-            </w:r>
-          </w:p>
-        </w:tc>
-        <w:tc>
-          <w:tcPr>
-            <w:tcW w:type="dxa" w:w="3081"/>
-            <w:tcMar>
-              <w:top w:w="60" w:type="dxa"/>
-              <w:bottom w:w="60" w:type="dxa"/>
-              <w:start w:w="100" w:type="dxa"/>
-              <w:end w:w="100" w:type="dxa"/>
-            </w:tcMar>
-            <w:shd w:val="clear" w:color="auto" w:fill="F3F6FB"/>
-          </w:tcPr>
-          <w:p>
-            <w:pPr>
-              <w:spacing w:after="0" w:line="252" w:lineRule="auto"/>
-            </w:pPr>
-            <w:r>
-              <w:rPr>
-                <w:sz w:val="19"/>
-              </w:rPr>
-              <w:t>POSIX signals</w:t>
-            </w:r>
-          </w:p>
-        </w:tc>
-        <w:tc>
-          <w:tcPr>
-            <w:tcW w:type="dxa" w:w="4740"/>
-            <w:tcMar>
-              <w:top w:w="60" w:type="dxa"/>
-              <w:bottom w:w="60" w:type="dxa"/>
-              <w:start w:w="100" w:type="dxa"/>
-              <w:end w:w="100" w:type="dxa"/>
-            </w:tcMar>
-            <w:shd w:val="clear" w:color="auto" w:fill="F3F6FB"/>
-          </w:tcPr>
-          <w:p>
-            <w:pPr>
-              <w:spacing w:after="0" w:line="252" w:lineRule="auto"/>
-            </w:pPr>
-            <w:r>
-              <w:rPr>
-                <w:rFonts w:ascii="Consolas" w:hAnsi="Consolas"/>
-                <w:sz w:val="17"/>
-                <w:shd w:val="clear" w:fill="EEF1F5"/>
-              </w:rPr>
-              <w:t>TerminateProcess</w:t>
-            </w:r>
-            <w:r>
-              <w:rPr>
-                <w:sz w:val="19"/>
-              </w:rPr>
-              <w:t xml:space="preserve"> (already behind </w:t>
-            </w:r>
-            <w:r>
-              <w:rPr>
-                <w:rFonts w:ascii="Consolas" w:hAnsi="Consolas"/>
-                <w:sz w:val="17"/>
-                <w:shd w:val="clear" w:fill="EEF1F5"/>
-              </w:rPr>
-              <w:t>#[cfg]</w:t>
-            </w:r>
-            <w:r>
-              <w:rPr>
-                <w:sz w:val="19"/>
-              </w:rPr>
-              <w:t>)</w:t>
-            </w:r>
-          </w:p>
-        </w:tc>
-      </w:tr>
-      <w:tr>
-        <w:tc>
-          <w:tcPr>
-            <w:tcW w:type="dxa" w:w="1817"/>
-            <w:tcMar>
-              <w:top w:w="60" w:type="dxa"/>
-              <w:bottom w:w="60" w:type="dxa"/>
-              <w:start w:w="100" w:type="dxa"/>
-              <w:end w:w="100" w:type="dxa"/>
-            </w:tcMar>
-          </w:tcPr>
-          <w:p>
-            <w:pPr>
-              <w:spacing w:after="0" w:line="252" w:lineRule="auto"/>
-            </w:pPr>
-            <w:r>
-              <w:rPr>
-                <w:b/>
-                <w:sz w:val="19"/>
-              </w:rPr>
-              <w:t>Software</w:t>
-            </w:r>
-          </w:p>
-        </w:tc>
-        <w:tc>
-          <w:tcPr>
-            <w:tcW w:type="dxa" w:w="3081"/>
-            <w:tcMar>
-              <w:top w:w="60" w:type="dxa"/>
-              <w:bottom w:w="60" w:type="dxa"/>
-              <w:start w:w="100" w:type="dxa"/>
-              <w:end w:w="100" w:type="dxa"/>
-            </w:tcMar>
-          </w:tcPr>
-          <w:p>
-            <w:pPr>
-              <w:spacing w:after="0" w:line="252" w:lineRule="auto"/>
-            </w:pPr>
-            <w:r>
-              <w:rPr>
-                <w:sz w:val="19"/>
-              </w:rPr>
-              <w:t>dpkg / snap / flatpak</w:t>
-            </w:r>
-          </w:p>
-        </w:tc>
-        <w:tc>
-          <w:tcPr>
-            <w:tcW w:type="dxa" w:w="4740"/>
-            <w:tcMar>
-              <w:top w:w="60" w:type="dxa"/>
-              <w:bottom w:w="60" w:type="dxa"/>
-              <w:start w:w="100" w:type="dxa"/>
-              <w:end w:w="100" w:type="dxa"/>
-            </w:tcMar>
-          </w:tcPr>
-          <w:p>
-            <w:pPr>
-              <w:spacing w:after="0" w:line="252" w:lineRule="auto"/>
-            </w:pPr>
-            <w:r>
-              <w:rPr>
-                <w:sz w:val="19"/>
-              </w:rPr>
-              <w:t>Registry uninstall keys, winget</w:t>
-            </w:r>
-          </w:p>
-        </w:tc>
-      </w:tr>
-      <w:tr>
-        <w:tc>
-          <w:tcPr>
-            <w:tcW w:type="dxa" w:w="1817"/>
-            <w:tcMar>
-              <w:top w:w="60" w:type="dxa"/>
-              <w:bottom w:w="60" w:type="dxa"/>
-              <w:start w:w="100" w:type="dxa"/>
-              <w:end w:w="100" w:type="dxa"/>
-            </w:tcMar>
-            <w:shd w:val="clear" w:color="auto" w:fill="F3F6FB"/>
-          </w:tcPr>
-          <w:p>
-            <w:pPr>
-              <w:spacing w:after="0" w:line="252" w:lineRule="auto"/>
-            </w:pPr>
-            <w:r>
-              <w:rPr>
-                <w:b/>
-                <w:sz w:val="19"/>
-              </w:rPr>
-              <w:t>Privileges</w:t>
-            </w:r>
-          </w:p>
-        </w:tc>
-        <w:tc>
-          <w:tcPr>
-            <w:tcW w:type="dxa" w:w="3081"/>
-            <w:tcMar>
-              <w:top w:w="60" w:type="dxa"/>
-              <w:bottom w:w="60" w:type="dxa"/>
-              <w:start w:w="100" w:type="dxa"/>
-              <w:end w:w="100" w:type="dxa"/>
-            </w:tcMar>
-            <w:shd w:val="clear" w:color="auto" w:fill="F3F6FB"/>
-          </w:tcPr>
-          <w:p>
-            <w:pPr>
-              <w:spacing w:after="0" w:line="252" w:lineRule="auto"/>
-            </w:pPr>
-            <w:r>
-              <w:rPr>
-                <w:sz w:val="19"/>
-              </w:rPr>
-              <w:t>pkexec helper</w:t>
-            </w:r>
-          </w:p>
-        </w:tc>
-        <w:tc>
-          <w:tcPr>
-            <w:tcW w:type="dxa" w:w="4740"/>
-            <w:tcMar>
-              <w:top w:w="60" w:type="dxa"/>
-              <w:bottom w:w="60" w:type="dxa"/>
-              <w:start w:w="100" w:type="dxa"/>
-              <w:end w:w="100" w:type="dxa"/>
-            </w:tcMar>
-            <w:shd w:val="clear" w:color="auto" w:fill="F3F6FB"/>
-          </w:tcPr>
-          <w:p>
-            <w:pPr>
-              <w:spacing w:after="0" w:line="252" w:lineRule="auto"/>
-            </w:pPr>
-            <w:r>
-              <w:rPr>
-                <w:sz w:val="19"/>
-              </w:rPr>
-              <w:t>Elevated helper via UAC</w:t>
-            </w:r>
-          </w:p>
-        </w:tc>
-      </w:tr>
-      <w:tr>
-        <w:tc>
-          <w:tcPr>
-            <w:tcW w:type="dxa" w:w="1817"/>
-            <w:tcMar>
-              <w:top w:w="60" w:type="dxa"/>
-              <w:bottom w:w="60" w:type="dxa"/>
-              <w:start w:w="100" w:type="dxa"/>
-              <w:end w:w="100" w:type="dxa"/>
-            </w:tcMar>
-          </w:tcPr>
-          <w:p>
-            <w:pPr>
-              <w:spacing w:after="0" w:line="252" w:lineRule="auto"/>
-            </w:pPr>
-            <w:r>
-              <w:rPr>
-                <w:b/>
-                <w:sz w:val="19"/>
-              </w:rPr>
-              <w:t>Network settings</w:t>
-            </w:r>
-          </w:p>
-        </w:tc>
-        <w:tc>
-          <w:tcPr>
-            <w:tcW w:type="dxa" w:w="3081"/>
-            <w:tcMar>
-              <w:top w:w="60" w:type="dxa"/>
-              <w:bottom w:w="60" w:type="dxa"/>
-              <w:start w:w="100" w:type="dxa"/>
-              <w:end w:w="100" w:type="dxa"/>
-            </w:tcMar>
-          </w:tcPr>
-          <w:p>
-            <w:pPr>
-              <w:spacing w:after="0" w:line="252" w:lineRule="auto"/>
-            </w:pPr>
-            <w:r>
-              <w:rPr>
-                <w:sz w:val="19"/>
-              </w:rPr>
-              <w:t>NetworkManager</w:t>
-            </w:r>
-          </w:p>
-        </w:tc>
-        <w:tc>
-          <w:tcPr>
-            <w:tcW w:type="dxa" w:w="4740"/>
-            <w:tcMar>
-              <w:top w:w="60" w:type="dxa"/>
-              <w:bottom w:w="60" w:type="dxa"/>
-              <w:start w:w="100" w:type="dxa"/>
-              <w:end w:w="100" w:type="dxa"/>
-            </w:tcMar>
-          </w:tcPr>
-          <w:p>
-            <w:pPr>
-              <w:spacing w:after="0" w:line="252" w:lineRule="auto"/>
-            </w:pPr>
-            <w:r>
-              <w:rPr>
-                <w:rFonts w:ascii="Consolas" w:hAnsi="Consolas"/>
-                <w:sz w:val="17"/>
-                <w:shd w:val="clear" w:fill="EEF1F5"/>
-              </w:rPr>
-              <w:t>netsh</w:t>
-            </w:r>
-            <w:r>
-              <w:rPr>
-                <w:sz w:val="19"/>
-              </w:rPr>
-              <w:t xml:space="preserve"> / WMI</w:t>
-            </w:r>
-          </w:p>
-        </w:tc>
-      </w:tr>
-      <w:tr>
-        <w:tc>
-          <w:tcPr>
-            <w:tcW w:type="dxa" w:w="1817"/>
-            <w:tcMar>
-              <w:top w:w="60" w:type="dxa"/>
-              <w:bottom w:w="60" w:type="dxa"/>
-              <w:start w:w="100" w:type="dxa"/>
-              <w:end w:w="100" w:type="dxa"/>
-            </w:tcMar>
-            <w:shd w:val="clear" w:color="auto" w:fill="F3F6FB"/>
-          </w:tcPr>
-          <w:p>
-            <w:pPr>
-              <w:spacing w:after="0" w:line="252" w:lineRule="auto"/>
-            </w:pPr>
-            <w:r>
-              <w:rPr>
-                <w:b/>
-                <w:sz w:val="19"/>
-              </w:rPr>
-              <w:t>Speed test, PacketForge</w:t>
-            </w:r>
-          </w:p>
-        </w:tc>
-        <w:tc>
-          <w:tcPr>
-            <w:tcW w:type="dxa" w:w="3081"/>
-            <w:tcMar>
-              <w:top w:w="60" w:type="dxa"/>
-              <w:bottom w:w="60" w:type="dxa"/>
-              <w:start w:w="100" w:type="dxa"/>
-              <w:end w:w="100" w:type="dxa"/>
-            </w:tcMar>
-            <w:shd w:val="clear" w:color="auto" w:fill="F3F6FB"/>
-          </w:tcPr>
-          <w:p>
-            <w:pPr>
-              <w:spacing w:after="0" w:line="252" w:lineRule="auto"/>
-            </w:pPr>
-            <w:r>
-              <w:rPr>
-                <w:rFonts w:ascii="Consolas" w:hAnsi="Consolas"/>
-                <w:sz w:val="17"/>
-                <w:shd w:val="clear" w:fill="EEF1F5"/>
-              </w:rPr>
-              <w:t>std::net</w:t>
-            </w:r>
-            <w:r>
-              <w:rPr>
-                <w:sz w:val="19"/>
-              </w:rPr>
-              <w:t xml:space="preserve">, </w:t>
-            </w:r>
-            <w:r>
-              <w:rPr>
-                <w:rFonts w:ascii="Consolas" w:hAnsi="Consolas"/>
-                <w:sz w:val="17"/>
-                <w:shd w:val="clear" w:fill="EEF1F5"/>
-              </w:rPr>
-              <w:t>serialport</w:t>
-            </w:r>
-          </w:p>
-        </w:tc>
-        <w:tc>
-          <w:tcPr>
-            <w:tcW w:type="dxa" w:w="4740"/>
-            <w:tcMar>
-              <w:top w:w="60" w:type="dxa"/>
-              <w:bottom w:w="60" w:type="dxa"/>
-              <w:start w:w="100" w:type="dxa"/>
-              <w:end w:w="100" w:type="dxa"/>
-            </w:tcMar>
-            <w:shd w:val="clear" w:color="auto" w:fill="F3F6FB"/>
-          </w:tcPr>
-          <w:p>
-            <w:pPr>
-              <w:spacing w:after="0" w:line="252" w:lineRule="auto"/>
-            </w:pPr>
-            <w:r>
-              <w:rPr>
-                <w:sz w:val="19"/>
-              </w:rPr>
-              <w:t>same code</w:t>
-            </w:r>
-          </w:p>
-        </w:tc>
-      </w:tr>
-      <w:tr>
-        <w:tc>
-          <w:tcPr>
-            <w:tcW w:type="dxa" w:w="1817"/>
-            <w:tcMar>
-              <w:top w:w="60" w:type="dxa"/>
-              <w:bottom w:w="60" w:type="dxa"/>
-              <w:start w:w="100" w:type="dxa"/>
-              <w:end w:w="100" w:type="dxa"/>
-            </w:tcMar>
-          </w:tcPr>
-          <w:p>
-            <w:pPr>
-              <w:spacing w:after="0" w:line="252" w:lineRule="auto"/>
-            </w:pPr>
-            <w:r>
-              <w:rPr>
-                <w:b/>
-                <w:sz w:val="19"/>
-              </w:rPr>
-              <w:t>NetLens capture</w:t>
-            </w:r>
-          </w:p>
-        </w:tc>
-        <w:tc>
-          <w:tcPr>
-            <w:tcW w:type="dxa" w:w="3081"/>
-            <w:tcMar>
-              <w:top w:w="60" w:type="dxa"/>
-              <w:bottom w:w="60" w:type="dxa"/>
-              <w:start w:w="100" w:type="dxa"/>
-              <w:end w:w="100" w:type="dxa"/>
-            </w:tcMar>
-          </w:tcPr>
-          <w:p>
-            <w:pPr>
-              <w:spacing w:after="0" w:line="252" w:lineRule="auto"/>
-            </w:pPr>
-            <w:r>
-              <w:rPr>
-                <w:rFonts w:ascii="Consolas" w:hAnsi="Consolas"/>
-                <w:sz w:val="17"/>
-                <w:shd w:val="clear" w:fill="EEF1F5"/>
-              </w:rPr>
-              <w:t>AF_PACKET</w:t>
-            </w:r>
-            <w:r>
-              <w:rPr>
-                <w:sz w:val="19"/>
-              </w:rPr>
-              <w:t xml:space="preserve"> helper with file capabilities</w:t>
-            </w:r>
-          </w:p>
-        </w:tc>
-        <w:tc>
-          <w:tcPr>
-            <w:tcW w:type="dxa" w:w="4740"/>
-            <w:tcMar>
-              <w:top w:w="60" w:type="dxa"/>
-              <w:bottom w:w="60" w:type="dxa"/>
-              <w:start w:w="100" w:type="dxa"/>
-              <w:end w:w="100" w:type="dxa"/>
-            </w:tcMar>
-          </w:tcPr>
-          <w:p>
-            <w:pPr>
-              <w:spacing w:after="0" w:line="252" w:lineRule="auto"/>
-            </w:pPr>
-            <w:r>
-              <w:rPr>
-                <w:sz w:val="19"/>
-              </w:rPr>
-              <w:t>Npcap driver + elevated helper; dissectors, filters, store and UI unchanged</w:t>
-            </w:r>
-          </w:p>
-        </w:tc>
-      </w:tr>
-      <w:tr>
-        <w:tc>
-          <w:tcPr>
-            <w:tcW w:type="dxa" w:w="1817"/>
-            <w:tcMar>
-              <w:top w:w="60" w:type="dxa"/>
-              <w:bottom w:w="60" w:type="dxa"/>
-              <w:start w:w="100" w:type="dxa"/>
-              <w:end w:w="100" w:type="dxa"/>
-            </w:tcMar>
-            <w:shd w:val="clear" w:color="auto" w:fill="F3F6FB"/>
-          </w:tcPr>
-          <w:p>
-            <w:pPr>
-              <w:spacing w:after="0" w:line="252" w:lineRule="auto"/>
-            </w:pPr>
-            <w:r>
-              <w:rPr>
-                <w:b/>
-                <w:sz w:val="19"/>
-              </w:rPr>
-              <w:t>Recorder</w:t>
-            </w:r>
-          </w:p>
-        </w:tc>
-        <w:tc>
-          <w:tcPr>
-            <w:tcW w:type="dxa" w:w="3081"/>
-            <w:tcMar>
-              <w:top w:w="60" w:type="dxa"/>
-              <w:bottom w:w="60" w:type="dxa"/>
-              <w:start w:w="100" w:type="dxa"/>
-              <w:end w:w="100" w:type="dxa"/>
-            </w:tcMar>
-            <w:shd w:val="clear" w:color="auto" w:fill="F3F6FB"/>
-          </w:tcPr>
-          <w:p>
-            <w:pPr>
-              <w:spacing w:after="0" w:line="252" w:lineRule="auto"/>
-            </w:pPr>
-            <w:r>
-              <w:rPr>
-                <w:rFonts w:ascii="Consolas" w:hAnsi="Consolas"/>
-                <w:sz w:val="17"/>
-                <w:shd w:val="clear" w:fill="EEF1F5"/>
-              </w:rPr>
-              <w:t>ximagesrc</w:t>
-            </w:r>
-            <w:r>
-              <w:rPr>
-                <w:sz w:val="19"/>
-              </w:rPr>
-              <w:t xml:space="preserve"> + </w:t>
-            </w:r>
-            <w:r>
-              <w:rPr>
-                <w:rFonts w:ascii="Consolas" w:hAnsi="Consolas"/>
-                <w:sz w:val="17"/>
-                <w:shd w:val="clear" w:fill="EEF1F5"/>
-              </w:rPr>
-              <w:t>pulsesrc</w:t>
-            </w:r>
-          </w:p>
-        </w:tc>
-        <w:tc>
-          <w:tcPr>
-            <w:tcW w:type="dxa" w:w="4740"/>
-            <w:tcMar>
-              <w:top w:w="60" w:type="dxa"/>
-              <w:bottom w:w="60" w:type="dxa"/>
-              <w:start w:w="100" w:type="dxa"/>
-              <w:end w:w="100" w:type="dxa"/>
-            </w:tcMar>
-            <w:shd w:val="clear" w:color="auto" w:fill="F3F6FB"/>
-          </w:tcPr>
-          <w:p>
-            <w:pPr>
-              <w:spacing w:after="0" w:line="252" w:lineRule="auto"/>
-            </w:pPr>
-            <w:r>
-              <w:rPr>
-                <w:rFonts w:ascii="Consolas" w:hAnsi="Consolas"/>
-                <w:sz w:val="17"/>
-                <w:shd w:val="clear" w:fill="EEF1F5"/>
-              </w:rPr>
-              <w:t>d3d11screencapturesrc</w:t>
-            </w:r>
-            <w:r>
-              <w:rPr>
-                <w:sz w:val="19"/>
-              </w:rPr>
-              <w:t xml:space="preserve"> + </w:t>
-            </w:r>
-            <w:r>
-              <w:rPr>
-                <w:rFonts w:ascii="Consolas" w:hAnsi="Consolas"/>
-                <w:sz w:val="17"/>
-                <w:shd w:val="clear" w:fill="EEF1F5"/>
-              </w:rPr>
-              <w:t>wasapisrc</w:t>
-            </w:r>
-            <w:r>
-              <w:rPr>
-                <w:sz w:val="19"/>
-              </w:rPr>
-              <w:t xml:space="preserve"> (GStreamer)</w:t>
-            </w:r>
-          </w:p>
-        </w:tc>
-      </w:tr>
-    </w:tbl>
     <w:p>
-      <w:pPr>
-        <w:spacing w:after="40"/>
-      </w:pPr>
+      <w:r>
+        <w:t xml:space="preserve">SysPulse targets </w:t>
+      </w:r>
+      <w:r>
+        <w:rPr>
+          <w:b/>
+        </w:rPr>
+        <w:t>Linux only</w:t>
+      </w:r>
+      <w:r>
+        <w:t xml:space="preserve"> (Ubuntu 22.04 and newer; other Debian-based distributions are likely to work). A Windows port was evaluated and dropped, so the code is free to use Linux interfaces directly: procfs and sysfs, NetworkManager, systemd, dpkg/Snap/Flatpak, polkit, </w:t>
+      </w:r>
+      <w:r>
+        <w:rPr>
+          <w:rFonts w:ascii="Consolas" w:hAnsi="Consolas"/>
+          <w:sz w:val="19"/>
+          <w:shd w:val="clear" w:fill="EEF1F5"/>
+        </w:rPr>
+        <w:t>AF_PACKET</w:t>
+      </w:r>
+      <w:r>
+        <w:t xml:space="preserve"> with file capabilities, X11 and PulseAudio/PipeWire.</w:t>
+      </w:r>
+    </w:p>
+    <w:p>
+      <w:r>
+        <w:t>Planned Linux coverage: Wayland screen recording through PipeWire, and packages for other distributions (see the roadmap).</w:t>
+      </w:r>
+    </w:p>
+    <w:p>
+      <w:r>
+        <w:t xml:space="preserve">---|---|---| | Metrics | </w:t>
+      </w:r>
+      <w:r>
+        <w:rPr>
+          <w:rFonts w:ascii="Consolas" w:hAnsi="Consolas"/>
+          <w:sz w:val="19"/>
+          <w:shd w:val="clear" w:fill="EEF1F5"/>
+        </w:rPr>
+        <w:t>sysinfo</w:t>
+      </w:r>
+      <w:r>
+        <w:t xml:space="preserve"> + procfs | </w:t>
+      </w:r>
+      <w:r>
+        <w:rPr>
+          <w:rFonts w:ascii="Consolas" w:hAnsi="Consolas"/>
+          <w:sz w:val="19"/>
+          <w:shd w:val="clear" w:fill="EEF1F5"/>
+        </w:rPr>
+        <w:t>sysinfo</w:t>
+      </w:r>
+      <w:r>
+        <w:t xml:space="preserve"> + PDH (shared code) | | GPU | NVML + DRM sysfs | NVML + DXGI / D3DKMT | | Hardware | sysfs | WMI | | Processes | POSIX signals | </w:t>
+      </w:r>
+      <w:r>
+        <w:rPr>
+          <w:rFonts w:ascii="Consolas" w:hAnsi="Consolas"/>
+          <w:sz w:val="19"/>
+          <w:shd w:val="clear" w:fill="EEF1F5"/>
+        </w:rPr>
+        <w:t>TerminateProcess</w:t>
+      </w:r>
+      <w:r>
+        <w:t xml:space="preserve"> (already behind </w:t>
+      </w:r>
+      <w:r>
+        <w:rPr>
+          <w:rFonts w:ascii="Consolas" w:hAnsi="Consolas"/>
+          <w:sz w:val="19"/>
+          <w:shd w:val="clear" w:fill="EEF1F5"/>
+        </w:rPr>
+        <w:t>#[cfg]</w:t>
+      </w:r>
+      <w:r>
+        <w:t xml:space="preserve">) | | Software | dpkg / snap / flatpak | Registry uninstall keys, winget | | Privileges | pkexec helper | Elevated helper via UAC | | Network settings | NetworkManager | </w:t>
+      </w:r>
+      <w:r>
+        <w:rPr>
+          <w:rFonts w:ascii="Consolas" w:hAnsi="Consolas"/>
+          <w:sz w:val="19"/>
+          <w:shd w:val="clear" w:fill="EEF1F5"/>
+        </w:rPr>
+        <w:t>netsh</w:t>
+      </w:r>
+      <w:r>
+        <w:t xml:space="preserve"> / WMI | | Speed test, PacketForge | </w:t>
+      </w:r>
+      <w:r>
+        <w:rPr>
+          <w:rFonts w:ascii="Consolas" w:hAnsi="Consolas"/>
+          <w:sz w:val="19"/>
+          <w:shd w:val="clear" w:fill="EEF1F5"/>
+        </w:rPr>
+        <w:t>std::net</w:t>
+      </w:r>
+      <w:r>
+        <w:t xml:space="preserve">, </w:t>
+      </w:r>
+      <w:r>
+        <w:rPr>
+          <w:rFonts w:ascii="Consolas" w:hAnsi="Consolas"/>
+          <w:sz w:val="19"/>
+          <w:shd w:val="clear" w:fill="EEF1F5"/>
+        </w:rPr>
+        <w:t>serialport</w:t>
+      </w:r>
+      <w:r>
+        <w:t xml:space="preserve"> | same code | | NetLens capture | </w:t>
+      </w:r>
+      <w:r>
+        <w:rPr>
+          <w:rFonts w:ascii="Consolas" w:hAnsi="Consolas"/>
+          <w:sz w:val="19"/>
+          <w:shd w:val="clear" w:fill="EEF1F5"/>
+        </w:rPr>
+        <w:t>AF_PACKET</w:t>
+      </w:r>
+      <w:r>
+        <w:t xml:space="preserve"> helper with file capabilities | Npcap driver + elevated helper; dissectors, filters, store and UI unchanged | | Recorder | </w:t>
+      </w:r>
+      <w:r>
+        <w:rPr>
+          <w:rFonts w:ascii="Consolas" w:hAnsi="Consolas"/>
+          <w:sz w:val="19"/>
+          <w:shd w:val="clear" w:fill="EEF1F5"/>
+        </w:rPr>
+        <w:t>ximagesrc</w:t>
+      </w:r>
+      <w:r>
+        <w:t xml:space="preserve"> + </w:t>
+      </w:r>
+      <w:r>
+        <w:rPr>
+          <w:rFonts w:ascii="Consolas" w:hAnsi="Consolas"/>
+          <w:sz w:val="19"/>
+          <w:shd w:val="clear" w:fill="EEF1F5"/>
+        </w:rPr>
+        <w:t>pulsesrc</w:t>
+      </w:r>
+      <w:r>
+        <w:t xml:space="preserve"> | </w:t>
+      </w:r>
+      <w:r>
+        <w:rPr>
+          <w:rFonts w:ascii="Consolas" w:hAnsi="Consolas"/>
+          <w:sz w:val="19"/>
+          <w:shd w:val="clear" w:fill="EEF1F5"/>
+        </w:rPr>
+        <w:t>d3d11screencapturesrc</w:t>
+      </w:r>
+      <w:r>
+        <w:t xml:space="preserve"> + </w:t>
+      </w:r>
+      <w:r>
+        <w:rPr>
+          <w:rFonts w:ascii="Consolas" w:hAnsi="Consolas"/>
+          <w:sz w:val="19"/>
+          <w:shd w:val="clear" w:fill="EEF1F5"/>
+        </w:rPr>
+        <w:t>wasapisrc</w:t>
+      </w:r>
+      <w:r>
+        <w:t xml:space="preserve"> (GStreamer) |</w:t>
+      </w:r>
     </w:p>
     <w:p>
       <w:r>

</xml_diff>

<commit_message>
Add App Launchers: desktop, start-menu and dock entries for any user
- Scan an application folder (native ELF with architecture check,
  AppImage, scripts, Python incl. venv, jar), icons, bundled libraries
  and Qt plugins
- Install per user: menu entry, trusted desktop icon, dock pin; other
  accounts via the polkit helper, writing into homes only as that user
- Folder access for other users through ACLs, only where needed
- Live checks, test run, registry with edit / add users / clean removal
- Docs, package dependencies (acl, desktop-file-utils), self-test example

Co-Authored-By: Claude Opus 5.5 <noreply@anthropic.com>
</commit_message>
<xml_diff>
--- a/docs/word/SysPulse Architecture Guide.docx
+++ b/docs/word/SysPulse Architecture Guide.docx
@@ -120,7 +120,7 @@
           <w:b/>
           <w:sz w:val="21"/>
         </w:rPr>
-        <w:t>09 October 2026</w:t>
+        <w:t>12 October 2026</w:t>
       </w:r>
     </w:p>
     <w:p>
@@ -357,10 +357,25 @@
     </w:p>
     <w:p>
       <w:pPr>
+        <w:spacing w:after="20"/>
+        <w:ind w:left="454"/>
+      </w:pPr>
+      <w:hyperlink w:anchor="sec14">
+        <w:r>
+          <w:rPr>
+            <w:color w:val="1F6FEB"/>
+            <w:sz w:val="20"/>
+          </w:rPr>
+          <w:t xml:space="preserve">5.9 App Launchers (launcher)</w:t>
+        </w:r>
+      </w:hyperlink>
+    </w:p>
+    <w:p>
+      <w:pPr>
         <w:spacing w:after="80"/>
         <w:ind w:left="0"/>
       </w:pPr>
-      <w:hyperlink w:anchor="sec14">
+      <w:hyperlink w:anchor="sec15">
         <w:r>
           <w:rPr>
             <w:color w:val="1F2937"/>
@@ -376,7 +391,7 @@
         <w:spacing w:after="80"/>
         <w:ind w:left="0"/>
       </w:pPr>
-      <w:hyperlink w:anchor="sec15">
+      <w:hyperlink w:anchor="sec16">
         <w:r>
           <w:rPr>
             <w:color w:val="1F2937"/>
@@ -392,7 +407,7 @@
         <w:spacing w:after="80"/>
         <w:ind w:left="0"/>
       </w:pPr>
-      <w:hyperlink w:anchor="sec16">
+      <w:hyperlink w:anchor="sec17">
         <w:r>
           <w:rPr>
             <w:color w:val="1F2937"/>
@@ -408,7 +423,7 @@
         <w:spacing w:after="20"/>
         <w:ind w:left="454"/>
       </w:pPr>
-      <w:hyperlink w:anchor="sec17">
+      <w:hyperlink w:anchor="sec18">
         <w:r>
           <w:rPr>
             <w:color w:val="1F6FEB"/>
@@ -423,7 +438,7 @@
         <w:spacing w:after="20"/>
         <w:ind w:left="454"/>
       </w:pPr>
-      <w:hyperlink w:anchor="sec18">
+      <w:hyperlink w:anchor="sec19">
         <w:r>
           <w:rPr>
             <w:color w:val="1F6FEB"/>
@@ -438,7 +453,7 @@
         <w:spacing w:after="80"/>
         <w:ind w:left="0"/>
       </w:pPr>
-      <w:hyperlink w:anchor="sec19">
+      <w:hyperlink w:anchor="sec20">
         <w:r>
           <w:rPr>
             <w:color w:val="1F2937"/>
@@ -454,7 +469,7 @@
         <w:spacing w:after="80"/>
         <w:ind w:left="0"/>
       </w:pPr>
-      <w:hyperlink w:anchor="sec20">
+      <w:hyperlink w:anchor="sec21">
         <w:r>
           <w:rPr>
             <w:color w:val="1F2937"/>
@@ -470,7 +485,7 @@
         <w:spacing w:after="80"/>
         <w:ind w:left="0"/>
       </w:pPr>
-      <w:hyperlink w:anchor="sec21">
+      <w:hyperlink w:anchor="sec22">
         <w:r>
           <w:rPr>
             <w:color w:val="1F2937"/>
@@ -486,7 +501,7 @@
         <w:spacing w:after="20"/>
         <w:ind w:left="454"/>
       </w:pPr>
-      <w:hyperlink w:anchor="sec22">
+      <w:hyperlink w:anchor="sec23">
         <w:r>
           <w:rPr>
             <w:color w:val="1F6FEB"/>
@@ -501,7 +516,7 @@
         <w:spacing w:after="20"/>
         <w:ind w:left="454"/>
       </w:pPr>
-      <w:hyperlink w:anchor="sec23">
+      <w:hyperlink w:anchor="sec24">
         <w:r>
           <w:rPr>
             <w:color w:val="1F6FEB"/>
@@ -516,7 +531,7 @@
         <w:spacing w:after="20"/>
         <w:ind w:left="454"/>
       </w:pPr>
-      <w:hyperlink w:anchor="sec24">
+      <w:hyperlink w:anchor="sec25">
         <w:r>
           <w:rPr>
             <w:color w:val="1F6FEB"/>
@@ -531,7 +546,7 @@
         <w:spacing w:after="80"/>
         <w:ind w:left="0"/>
       </w:pPr>
-      <w:hyperlink w:anchor="sec25">
+      <w:hyperlink w:anchor="sec26">
         <w:r>
           <w:rPr>
             <w:color w:val="1F2937"/>
@@ -547,7 +562,7 @@
         <w:spacing w:after="80"/>
         <w:ind w:left="0"/>
       </w:pPr>
-      <w:hyperlink w:anchor="sec26">
+      <w:hyperlink w:anchor="sec27">
         <w:r>
           <w:rPr>
             <w:color w:val="1F2937"/>
@@ -563,7 +578,7 @@
         <w:spacing w:after="80"/>
         <w:ind w:left="0"/>
       </w:pPr>
-      <w:hyperlink w:anchor="sec27">
+      <w:hyperlink w:anchor="sec28">
         <w:r>
           <w:rPr>
             <w:color w:val="1F2937"/>
@@ -579,7 +594,7 @@
         <w:spacing w:after="80"/>
         <w:ind w:left="0"/>
       </w:pPr>
-      <w:hyperlink w:anchor="sec28">
+      <w:hyperlink w:anchor="sec29">
         <w:r>
           <w:rPr>
             <w:color w:val="1F2937"/>
@@ -595,7 +610,7 @@
         <w:spacing w:after="80"/>
         <w:ind w:left="0"/>
       </w:pPr>
-      <w:hyperlink w:anchor="sec29">
+      <w:hyperlink w:anchor="sec30">
         <w:r>
           <w:rPr>
             <w:color w:val="1F2937"/>
@@ -611,7 +626,7 @@
         <w:spacing w:after="80"/>
         <w:ind w:left="0"/>
       </w:pPr>
-      <w:hyperlink w:anchor="sec30">
+      <w:hyperlink w:anchor="sec31">
         <w:r>
           <w:rPr>
             <w:color w:val="1F2937"/>
@@ -627,7 +642,7 @@
         <w:spacing w:after="80"/>
         <w:ind w:left="0"/>
       </w:pPr>
-      <w:hyperlink w:anchor="sec31">
+      <w:hyperlink w:anchor="sec32">
         <w:r>
           <w:rPr>
             <w:color w:val="1F2937"/>
@@ -3279,7 +3294,7 @@
                 <w:b/>
                 <w:sz w:val="19"/>
               </w:rPr>
-              <w:t>Parallel filtering</w:t>
+              <w:t>App Launchers</w:t>
             </w:r>
           </w:p>
         </w:tc>
@@ -3300,11 +3315,79 @@
             </w:pPr>
             <w:r>
               <w:rPr>
+                <w:sz w:val="19"/>
+              </w:rPr>
+              <w:t xml:space="preserve">freedesktop Desktop Entry spec, </w:t>
+            </w:r>
+            <w:r>
+              <w:rPr>
                 <w:rFonts w:ascii="Consolas" w:hAnsi="Consolas"/>
                 <w:sz w:val="17"/>
                 <w:shd w:val="clear" w:fill="EEF1F5"/>
               </w:rPr>
-              <w:t>rayon</w:t>
+              <w:t>runuser</w:t>
+            </w:r>
+            <w:r>
+              <w:rPr>
+                <w:sz w:val="19"/>
+              </w:rPr>
+              <w:t xml:space="preserve">, </w:t>
+            </w:r>
+            <w:r>
+              <w:rPr>
+                <w:rFonts w:ascii="Consolas" w:hAnsi="Consolas"/>
+                <w:sz w:val="17"/>
+                <w:shd w:val="clear" w:fill="EEF1F5"/>
+              </w:rPr>
+              <w:t>setfacl</w:t>
+            </w:r>
+            <w:r>
+              <w:rPr>
+                <w:sz w:val="19"/>
+              </w:rPr>
+              <w:t xml:space="preserve">, </w:t>
+            </w:r>
+            <w:r>
+              <w:rPr>
+                <w:rFonts w:ascii="Consolas" w:hAnsi="Consolas"/>
+                <w:sz w:val="17"/>
+                <w:shd w:val="clear" w:fill="EEF1F5"/>
+              </w:rPr>
+              <w:t>gio</w:t>
+            </w:r>
+            <w:r>
+              <w:rPr>
+                <w:sz w:val="19"/>
+              </w:rPr>
+              <w:t xml:space="preserve"> metadata, </w:t>
+            </w:r>
+            <w:r>
+              <w:rPr>
+                <w:rFonts w:ascii="Consolas" w:hAnsi="Consolas"/>
+                <w:sz w:val="17"/>
+                <w:shd w:val="clear" w:fill="EEF1F5"/>
+              </w:rPr>
+              <w:t>gsettings</w:t>
+            </w:r>
+            <w:r>
+              <w:rPr>
+                <w:sz w:val="19"/>
+              </w:rPr>
+              <w:t xml:space="preserve">, </w:t>
+            </w:r>
+            <w:r>
+              <w:rPr>
+                <w:rFonts w:ascii="Consolas" w:hAnsi="Consolas"/>
+                <w:sz w:val="17"/>
+                <w:shd w:val="clear" w:fill="EEF1F5"/>
+              </w:rPr>
+              <w:t>image</w:t>
+            </w:r>
+            <w:r>
+              <w:rPr>
+                <w:sz w:val="19"/>
+              </w:rPr>
+              <w:t xml:space="preserve"> crate</w:t>
             </w:r>
           </w:p>
         </w:tc>
@@ -3327,7 +3410,7 @@
               <w:rPr>
                 <w:sz w:val="19"/>
               </w:rPr>
-              <w:t>1</w:t>
+              <w:t>—</w:t>
             </w:r>
           </w:p>
         </w:tc>
@@ -3350,7 +3433,7 @@
               <w:rPr>
                 <w:sz w:val="19"/>
               </w:rPr>
-              <w:t>Display filters over millions of packets use every core</w:t>
+              <w:t>Standard Ubuntu mechanisms only: menu entries, trusted desktop icons (DING), dock favourites, POSIX ACLs</w:t>
             </w:r>
           </w:p>
         </w:tc>
@@ -3375,7 +3458,7 @@
                 <w:b/>
                 <w:sz w:val="19"/>
               </w:rPr>
-              <w:t>Recorder</w:t>
+              <w:t>Parallel filtering</w:t>
             </w:r>
           </w:p>
         </w:tc>
@@ -3395,30 +3478,11 @@
             </w:pPr>
             <w:r>
               <w:rPr>
-                <w:b/>
-                <w:sz w:val="19"/>
-              </w:rPr>
-              <w:t>GStreamer</w:t>
-            </w:r>
-            <w:r>
-              <w:rPr>
-                <w:sz w:val="19"/>
-              </w:rPr>
-              <w:t xml:space="preserve"> via </w:t>
-            </w:r>
-            <w:r>
-              <w:rPr>
                 <w:rFonts w:ascii="Consolas" w:hAnsi="Consolas"/>
                 <w:sz w:val="17"/>
                 <w:shd w:val="clear" w:fill="EEF1F5"/>
               </w:rPr>
-              <w:t>gstreamer</w:t>
-            </w:r>
-            <w:r>
-              <w:rPr>
-                <w:sz w:val="19"/>
-              </w:rPr>
-              <w:t xml:space="preserve"> crate</w:t>
+              <w:t>rayon</w:t>
             </w:r>
           </w:p>
         </w:tc>
@@ -3440,7 +3504,7 @@
               <w:rPr>
                 <w:sz w:val="19"/>
               </w:rPr>
-              <w:t>0.25 / GStreamer 1.20</w:t>
+              <w:t>1</w:t>
             </w:r>
           </w:p>
         </w:tc>
@@ -3460,31 +3524,9 @@
             </w:pPr>
             <w:r>
               <w:rPr>
-                <w:rFonts w:ascii="Consolas" w:hAnsi="Consolas"/>
-                <w:sz w:val="17"/>
-                <w:shd w:val="clear" w:fill="EEF1F5"/>
-              </w:rPr>
-              <w:t>ximagesrc</w:t>
-            </w:r>
-            <w:r>
-              <w:rPr>
-                <w:sz w:val="19"/>
-              </w:rPr>
-              <w:t xml:space="preserve"> + </w:t>
-            </w:r>
-            <w:r>
-              <w:rPr>
-                <w:rFonts w:ascii="Consolas" w:hAnsi="Consolas"/>
-                <w:sz w:val="17"/>
-                <w:shd w:val="clear" w:fill="EEF1F5"/>
-              </w:rPr>
-              <w:t>pulsesrc</w:t>
-            </w:r>
-            <w:r>
-              <w:rPr>
-                <w:sz w:val="19"/>
-              </w:rPr>
-              <w:t xml:space="preserve"> → encoders → muxers; pause without gaps</w:t>
+                <w:sz w:val="19"/>
+              </w:rPr>
+              <w:t>Display filters over millions of packets use every core</w:t>
             </w:r>
           </w:p>
         </w:tc>
@@ -3510,7 +3552,7 @@
                 <w:b/>
                 <w:sz w:val="19"/>
               </w:rPr>
-              <w:t>Privileges</w:t>
+              <w:t>Recorder</w:t>
             </w:r>
           </w:p>
         </w:tc>
@@ -3531,25 +3573,30 @@
             </w:pPr>
             <w:r>
               <w:rPr>
+                <w:b/>
+                <w:sz w:val="19"/>
+              </w:rPr>
+              <w:t>GStreamer</w:t>
+            </w:r>
+            <w:r>
+              <w:rPr>
+                <w:sz w:val="19"/>
+              </w:rPr>
+              <w:t xml:space="preserve"> via </w:t>
+            </w:r>
+            <w:r>
+              <w:rPr>
                 <w:rFonts w:ascii="Consolas" w:hAnsi="Consolas"/>
                 <w:sz w:val="17"/>
                 <w:shd w:val="clear" w:fill="EEF1F5"/>
               </w:rPr>
-              <w:t>pkexec</w:t>
-            </w:r>
-            <w:r>
-              <w:rPr>
-                <w:sz w:val="19"/>
-              </w:rPr>
-              <w:t xml:space="preserve"> + polkit policy + </w:t>
-            </w:r>
-            <w:r>
-              <w:rPr>
-                <w:rFonts w:ascii="Consolas" w:hAnsi="Consolas"/>
-                <w:sz w:val="17"/>
-                <w:shd w:val="clear" w:fill="EEF1F5"/>
-              </w:rPr>
-              <w:t>syspulse-helper</w:t>
+              <w:t>gstreamer</w:t>
+            </w:r>
+            <w:r>
+              <w:rPr>
+                <w:sz w:val="19"/>
+              </w:rPr>
+              <w:t xml:space="preserve"> crate</w:t>
             </w:r>
           </w:p>
         </w:tc>
@@ -3572,7 +3619,7 @@
               <w:rPr>
                 <w:sz w:val="19"/>
               </w:rPr>
-              <w:t>—</w:t>
+              <w:t>0.25 / GStreamer 1.20</w:t>
             </w:r>
           </w:p>
         </w:tc>
@@ -3593,9 +3640,31 @@
             </w:pPr>
             <w:r>
               <w:rPr>
-                <w:sz w:val="19"/>
-              </w:rPr>
-              <w:t>Standard Ubuntu password dialog</w:t>
+                <w:rFonts w:ascii="Consolas" w:hAnsi="Consolas"/>
+                <w:sz w:val="17"/>
+                <w:shd w:val="clear" w:fill="EEF1F5"/>
+              </w:rPr>
+              <w:t>ximagesrc</w:t>
+            </w:r>
+            <w:r>
+              <w:rPr>
+                <w:sz w:val="19"/>
+              </w:rPr>
+              <w:t xml:space="preserve"> + </w:t>
+            </w:r>
+            <w:r>
+              <w:rPr>
+                <w:rFonts w:ascii="Consolas" w:hAnsi="Consolas"/>
+                <w:sz w:val="17"/>
+                <w:shd w:val="clear" w:fill="EEF1F5"/>
+              </w:rPr>
+              <w:t>pulsesrc</w:t>
+            </w:r>
+            <w:r>
+              <w:rPr>
+                <w:sz w:val="19"/>
+              </w:rPr>
+              <w:t xml:space="preserve"> → encoders → muxers; pause without gaps</w:t>
             </w:r>
           </w:p>
         </w:tc>
@@ -3620,7 +3689,7 @@
                 <w:b/>
                 <w:sz w:val="19"/>
               </w:rPr>
-              <w:t>Tauri plugins</w:t>
+              <w:t>Privileges</w:t>
             </w:r>
           </w:p>
         </w:tc>
@@ -3640,9 +3709,25 @@
             </w:pPr>
             <w:r>
               <w:rPr>
-                <w:sz w:val="19"/>
-              </w:rPr>
-              <w:t>dialog, opener, notification, global-shortcut</w:t>
+                <w:rFonts w:ascii="Consolas" w:hAnsi="Consolas"/>
+                <w:sz w:val="17"/>
+                <w:shd w:val="clear" w:fill="EEF1F5"/>
+              </w:rPr>
+              <w:t>pkexec</w:t>
+            </w:r>
+            <w:r>
+              <w:rPr>
+                <w:sz w:val="19"/>
+              </w:rPr>
+              <w:t xml:space="preserve"> + polkit policy + </w:t>
+            </w:r>
+            <w:r>
+              <w:rPr>
+                <w:rFonts w:ascii="Consolas" w:hAnsi="Consolas"/>
+                <w:sz w:val="17"/>
+                <w:shd w:val="clear" w:fill="EEF1F5"/>
+              </w:rPr>
+              <w:t>syspulse-helper</w:t>
             </w:r>
           </w:p>
         </w:tc>
@@ -3664,7 +3749,7 @@
               <w:rPr>
                 <w:sz w:val="19"/>
               </w:rPr>
-              <w:t>2.x</w:t>
+              <w:t>—</w:t>
             </w:r>
           </w:p>
         </w:tc>
@@ -3686,7 +3771,7 @@
               <w:rPr>
                 <w:sz w:val="19"/>
               </w:rPr>
-              <w:t>File dialogs, open/reveal, desktop notifications, recorder hotkeys</w:t>
+              <w:t>Standard Ubuntu password dialog</w:t>
             </w:r>
           </w:p>
         </w:tc>
@@ -3712,7 +3797,7 @@
                 <w:b/>
                 <w:sz w:val="19"/>
               </w:rPr>
-              <w:t>Tray</w:t>
+              <w:t>Tauri plugins</w:t>
             </w:r>
           </w:p>
         </w:tc>
@@ -3735,21 +3820,7 @@
               <w:rPr>
                 <w:sz w:val="19"/>
               </w:rPr>
-              <w:t xml:space="preserve">Tauri </w:t>
-            </w:r>
-            <w:r>
-              <w:rPr>
-                <w:rFonts w:ascii="Consolas" w:hAnsi="Consolas"/>
-                <w:sz w:val="17"/>
-                <w:shd w:val="clear" w:fill="EEF1F5"/>
-              </w:rPr>
-              <w:t>tray-icon</w:t>
-            </w:r>
-            <w:r>
-              <w:rPr>
-                <w:sz w:val="19"/>
-              </w:rPr>
-              <w:t xml:space="preserve"> (libayatana-appindicator)</w:t>
+              <w:t>dialog, opener, notification, global-shortcut</w:t>
             </w:r>
           </w:p>
         </w:tc>
@@ -3772,7 +3843,7 @@
               <w:rPr>
                 <w:sz w:val="19"/>
               </w:rPr>
-              <w:t>—</w:t>
+              <w:t>2.x</w:t>
             </w:r>
           </w:p>
         </w:tc>
@@ -3795,7 +3866,7 @@
               <w:rPr>
                 <w:sz w:val="19"/>
               </w:rPr>
-              <w:t>Top-bar recorder menu</w:t>
+              <w:t>File dialogs, open/reveal, desktop notifications, recorder hotkeys</w:t>
             </w:r>
           </w:p>
         </w:tc>
@@ -3820,7 +3891,7 @@
                 <w:b/>
                 <w:sz w:val="19"/>
               </w:rPr>
-              <w:t>Packaging</w:t>
+              <w:t>Tray</w:t>
             </w:r>
           </w:p>
         </w:tc>
@@ -3840,31 +3911,23 @@
             </w:pPr>
             <w:r>
               <w:rPr>
+                <w:sz w:val="19"/>
+              </w:rPr>
+              <w:t xml:space="preserve">Tauri </w:t>
+            </w:r>
+            <w:r>
+              <w:rPr>
                 <w:rFonts w:ascii="Consolas" w:hAnsi="Consolas"/>
                 <w:sz w:val="17"/>
                 <w:shd w:val="clear" w:fill="EEF1F5"/>
               </w:rPr>
-              <w:t>tauri build</w:t>
-            </w:r>
-            <w:r>
-              <w:rPr>
-                <w:sz w:val="19"/>
-              </w:rPr>
-              <w:t xml:space="preserve"> → </w:t>
-            </w:r>
-            <w:r>
-              <w:rPr>
-                <w:rFonts w:ascii="Consolas" w:hAnsi="Consolas"/>
-                <w:sz w:val="17"/>
-                <w:shd w:val="clear" w:fill="EEF1F5"/>
-              </w:rPr>
-              <w:t>.deb</w:t>
-            </w:r>
-            <w:r>
-              <w:rPr>
-                <w:sz w:val="19"/>
-              </w:rPr>
-              <w:t>, AppImage</w:t>
+              <w:t>tray-icon</w:t>
+            </w:r>
+            <w:r>
+              <w:rPr>
+                <w:sz w:val="19"/>
+              </w:rPr>
+              <w:t xml:space="preserve"> (libayatana-appindicator)</w:t>
             </w:r>
           </w:p>
         </w:tc>
@@ -3886,7 +3949,7 @@
               <w:rPr>
                 <w:sz w:val="19"/>
               </w:rPr>
-              <w:t>CLI 2.12</w:t>
+              <w:t>—</w:t>
             </w:r>
           </w:p>
         </w:tc>
@@ -3899,6 +3962,123 @@
               <w:start w:w="100" w:type="dxa"/>
               <w:end w:w="100" w:type="dxa"/>
             </w:tcMar>
+          </w:tcPr>
+          <w:p>
+            <w:pPr>
+              <w:spacing w:after="0" w:line="252" w:lineRule="auto"/>
+            </w:pPr>
+            <w:r>
+              <w:rPr>
+                <w:sz w:val="19"/>
+              </w:rPr>
+              <w:t>Top-bar recorder menu</w:t>
+            </w:r>
+          </w:p>
+        </w:tc>
+      </w:tr>
+      <w:tr>
+        <w:tc>
+          <w:tcPr>
+            <w:tcW w:type="dxa" w:w="1091"/>
+            <w:tcMar>
+              <w:top w:w="60" w:type="dxa"/>
+              <w:bottom w:w="60" w:type="dxa"/>
+              <w:start w:w="100" w:type="dxa"/>
+              <w:end w:w="100" w:type="dxa"/>
+            </w:tcMar>
+            <w:shd w:val="clear" w:color="auto" w:fill="F3F6FB"/>
+          </w:tcPr>
+          <w:p>
+            <w:pPr>
+              <w:spacing w:after="0" w:line="252" w:lineRule="auto"/>
+            </w:pPr>
+            <w:r>
+              <w:rPr>
+                <w:b/>
+                <w:sz w:val="19"/>
+              </w:rPr>
+              <w:t>Packaging</w:t>
+            </w:r>
+          </w:p>
+        </w:tc>
+        <w:tc>
+          <w:tcPr>
+            <w:tcW w:type="dxa" w:w="3637"/>
+            <w:tcMar>
+              <w:top w:w="60" w:type="dxa"/>
+              <w:bottom w:w="60" w:type="dxa"/>
+              <w:start w:w="100" w:type="dxa"/>
+              <w:end w:w="100" w:type="dxa"/>
+            </w:tcMar>
+            <w:shd w:val="clear" w:color="auto" w:fill="F3F6FB"/>
+          </w:tcPr>
+          <w:p>
+            <w:pPr>
+              <w:spacing w:after="0" w:line="252" w:lineRule="auto"/>
+            </w:pPr>
+            <w:r>
+              <w:rPr>
+                <w:rFonts w:ascii="Consolas" w:hAnsi="Consolas"/>
+                <w:sz w:val="17"/>
+                <w:shd w:val="clear" w:fill="EEF1F5"/>
+              </w:rPr>
+              <w:t>tauri build</w:t>
+            </w:r>
+            <w:r>
+              <w:rPr>
+                <w:sz w:val="19"/>
+              </w:rPr>
+              <w:t xml:space="preserve"> → </w:t>
+            </w:r>
+            <w:r>
+              <w:rPr>
+                <w:rFonts w:ascii="Consolas" w:hAnsi="Consolas"/>
+                <w:sz w:val="17"/>
+                <w:shd w:val="clear" w:fill="EEF1F5"/>
+              </w:rPr>
+              <w:t>.deb</w:t>
+            </w:r>
+            <w:r>
+              <w:rPr>
+                <w:sz w:val="19"/>
+              </w:rPr>
+              <w:t>, AppImage</w:t>
+            </w:r>
+          </w:p>
+        </w:tc>
+        <w:tc>
+          <w:tcPr>
+            <w:tcW w:type="dxa" w:w="1273"/>
+            <w:tcMar>
+              <w:top w:w="60" w:type="dxa"/>
+              <w:bottom w:w="60" w:type="dxa"/>
+              <w:start w:w="100" w:type="dxa"/>
+              <w:end w:w="100" w:type="dxa"/>
+            </w:tcMar>
+            <w:shd w:val="clear" w:color="auto" w:fill="F3F6FB"/>
+          </w:tcPr>
+          <w:p>
+            <w:pPr>
+              <w:spacing w:after="0" w:line="252" w:lineRule="auto"/>
+            </w:pPr>
+            <w:r>
+              <w:rPr>
+                <w:sz w:val="19"/>
+              </w:rPr>
+              <w:t>CLI 2.12</w:t>
+            </w:r>
+          </w:p>
+        </w:tc>
+        <w:tc>
+          <w:tcPr>
+            <w:tcW w:type="dxa" w:w="3637"/>
+            <w:tcMar>
+              <w:top w:w="60" w:type="dxa"/>
+              <w:bottom w:w="60" w:type="dxa"/>
+              <w:start w:w="100" w:type="dxa"/>
+              <w:end w:w="100" w:type="dxa"/>
+            </w:tcMar>
+            <w:shd w:val="clear" w:color="auto" w:fill="F3F6FB"/>
           </w:tcPr>
           <w:p>
             <w:pPr>
@@ -4308,7 +4488,7 @@
               <w:rPr>
                 <w:rFonts w:ascii="Consolas" w:hAnsi="Consolas"/>
                 <w:color w:val="1F2937"/>
-                <w:sz w:val="16"/>
+                <w:sz w:val="14"/>
               </w:rPr>
               <w:t>UBUNTU_SYSTEM_Monitor/</w:t>
               <w:br/>
@@ -4317,7 +4497,7 @@
               <w:rPr>
                 <w:rFonts w:ascii="Consolas" w:hAnsi="Consolas"/>
                 <w:color w:val="1F2937"/>
-                <w:sz w:val="16"/>
+                <w:sz w:val="14"/>
               </w:rPr>
               <w:t>├── Cargo.toml                    Rust workspace (crates/core, src-tauri)</w:t>
               <w:br/>
@@ -4326,7 +4506,7 @@
               <w:rPr>
                 <w:rFonts w:ascii="Consolas" w:hAnsi="Consolas"/>
                 <w:color w:val="1F2937"/>
-                <w:sz w:val="16"/>
+                <w:sz w:val="14"/>
               </w:rPr>
               <w:t>├── package.json                  Tauri CLI scripts (dev, build)</w:t>
               <w:br/>
@@ -4335,7 +4515,7 @@
               <w:rPr>
                 <w:rFonts w:ascii="Consolas" w:hAnsi="Consolas"/>
                 <w:color w:val="1F2937"/>
-                <w:sz w:val="16"/>
+                <w:sz w:val="14"/>
               </w:rPr>
               <w:t>├── crates/core/                  syspulse-core — all OS logic, no UI code</w:t>
               <w:br/>
@@ -4344,7 +4524,7 @@
               <w:rPr>
                 <w:rFonts w:ascii="Consolas" w:hAnsi="Consolas"/>
                 <w:color w:val="1F2937"/>
-                <w:sz w:val="16"/>
+                <w:sz w:val="14"/>
               </w:rPr>
               <w:t>│   ├── src/</w:t>
               <w:br/>
@@ -4353,7 +4533,7 @@
               <w:rPr>
                 <w:rFonts w:ascii="Consolas" w:hAnsi="Consolas"/>
                 <w:color w:val="1F2937"/>
-                <w:sz w:val="16"/>
+                <w:sz w:val="14"/>
               </w:rPr>
               <w:t>│   │   ├── lib.rs                module list</w:t>
               <w:br/>
@@ -4362,7 +4542,7 @@
               <w:rPr>
                 <w:rFonts w:ascii="Consolas" w:hAnsi="Consolas"/>
                 <w:color w:val="1F2937"/>
-                <w:sz w:val="16"/>
+                <w:sz w:val="14"/>
               </w:rPr>
               <w:t>│   │   ├── error.rs              CoreError (serialises to a message)</w:t>
               <w:br/>
@@ -4371,7 +4551,7 @@
               <w:rPr>
                 <w:rFonts w:ascii="Consolas" w:hAnsi="Consolas"/>
                 <w:color w:val="1F2937"/>
-                <w:sz w:val="16"/>
+                <w:sz w:val="14"/>
               </w:rPr>
               <w:t>│   │   ├── models.rs             telemetry / process / hardware data types</w:t>
               <w:br/>
@@ -4380,7 +4560,7 @@
               <w:rPr>
                 <w:rFonts w:ascii="Consolas" w:hAnsi="Consolas"/>
                 <w:color w:val="1F2937"/>
-                <w:sz w:val="16"/>
+                <w:sz w:val="14"/>
               </w:rPr>
               <w:t>│   │   ├── util.rs               sysfs readers, PCI/USB ID database, base64, human sizes</w:t>
               <w:br/>
@@ -4389,7 +4569,7 @@
               <w:rPr>
                 <w:rFonts w:ascii="Consolas" w:hAnsi="Consolas"/>
                 <w:color w:val="1F2937"/>
-                <w:sz w:val="16"/>
+                <w:sz w:val="14"/>
               </w:rPr>
               <w:t>│   │   ├── fsutil.rs             disk usage, safe deletion rules, home dir</w:t>
               <w:br/>
@@ -4398,7 +4578,7 @@
               <w:rPr>
                 <w:rFonts w:ascii="Consolas" w:hAnsi="Consolas"/>
                 <w:color w:val="1F2937"/>
-                <w:sz w:val="16"/>
+                <w:sz w:val="14"/>
               </w:rPr>
               <w:t>│   │   ├── monitor.rs            CPU / memory / disks / network / sensors / battery sampler</w:t>
               <w:br/>
@@ -4407,7 +4587,7 @@
               <w:rPr>
                 <w:rFonts w:ascii="Consolas" w:hAnsi="Consolas"/>
                 <w:color w:val="1F2937"/>
-                <w:sz w:val="16"/>
+                <w:sz w:val="14"/>
               </w:rPr>
               <w:t>│   │   ├── gpu/                  mod.rs (manager), nvidia.rs (NVML), drm.rs (AMD/Intel sysfs)</w:t>
               <w:br/>
@@ -4416,7 +4596,7 @@
               <w:rPr>
                 <w:rFonts w:ascii="Consolas" w:hAnsi="Consolas"/>
                 <w:color w:val="1F2937"/>
-                <w:sz w:val="16"/>
+                <w:sz w:val="14"/>
               </w:rPr>
               <w:t>│   │   ├── hardware/             mod.rs, linux.rs (inventory)</w:t>
               <w:br/>
@@ -4425,7 +4605,7 @@
               <w:rPr>
                 <w:rFonts w:ascii="Consolas" w:hAnsi="Consolas"/>
                 <w:color w:val="1F2937"/>
-                <w:sz w:val="16"/>
+                <w:sz w:val="14"/>
               </w:rPr>
               <w:t>│   │   ├── process.rs            process table, details, signals, renice, open files/sockets</w:t>
               <w:br/>
@@ -4434,7 +4614,7 @@
               <w:rPr>
                 <w:rFonts w:ascii="Consolas" w:hAnsi="Consolas"/>
                 <w:color w:val="1F2937"/>
-                <w:sz w:val="16"/>
+                <w:sz w:val="14"/>
               </w:rPr>
               <w:t>│   │   ├── software/             mod.rs, apt.rs, snap.rs, flatpak.rs, desktop.rs, icons.rs</w:t>
               <w:br/>
@@ -4443,7 +4623,7 @@
               <w:rPr>
                 <w:rFonts w:ascii="Consolas" w:hAnsi="Consolas"/>
                 <w:color w:val="1F2937"/>
-                <w:sz w:val="16"/>
+                <w:sz w:val="14"/>
               </w:rPr>
               <w:t>│   │   ├── cleaner.rs            cache targets (user + system)</w:t>
               <w:br/>
@@ -4452,7 +4632,7 @@
               <w:rPr>
                 <w:rFonts w:ascii="Consolas" w:hAnsi="Consolas"/>
                 <w:color w:val="1F2937"/>
-                <w:sz w:val="16"/>
+                <w:sz w:val="14"/>
               </w:rPr>
               <w:t>│   │   ├── largefiles.rs         parallel scanner, folder tree, trash/delete</w:t>
               <w:br/>
@@ -4461,7 +4641,7 @@
               <w:rPr>
                 <w:rFonts w:ascii="Consolas" w:hAnsi="Consolas"/>
                 <w:color w:val="1F2937"/>
-                <w:sz w:val="16"/>
+                <w:sz w:val="14"/>
               </w:rPr>
               <w:t>│   │   ├── search.rs             file search engine</w:t>
               <w:br/>
@@ -4470,7 +4650,7 @@
               <w:rPr>
                 <w:rFonts w:ascii="Consolas" w:hAnsi="Consolas"/>
                 <w:color w:val="1F2937"/>
-                <w:sz w:val="16"/>
+                <w:sz w:val="14"/>
               </w:rPr>
               <w:t>│   │   ├── services.rs           systemd services</w:t>
               <w:br/>
@@ -4479,7 +4659,7 @@
               <w:rPr>
                 <w:rFonts w:ascii="Consolas" w:hAnsi="Consolas"/>
                 <w:color w:val="1F2937"/>
-                <w:sz w:val="16"/>
+                <w:sz w:val="14"/>
               </w:rPr>
               <w:t>│   │   ├── startup.rs            XDG autostart entries</w:t>
               <w:br/>
@@ -4488,7 +4668,7 @@
               <w:rPr>
                 <w:rFonts w:ascii="Consolas" w:hAnsi="Consolas"/>
                 <w:color w:val="1F2937"/>
-                <w:sz w:val="16"/>
+                <w:sz w:val="14"/>
               </w:rPr>
               <w:t>│   │   ├── netconn.rs            system-wide sockets with owners</w:t>
               <w:br/>
@@ -4497,7 +4677,7 @@
               <w:rPr>
                 <w:rFonts w:ascii="Consolas" w:hAnsi="Consolas"/>
                 <w:color w:val="1F2937"/>
-                <w:sz w:val="16"/>
+                <w:sz w:val="14"/>
               </w:rPr>
               <w:t>│   │   ├── alerts.rs             threshold alert engine</w:t>
               <w:br/>
@@ -4506,7 +4686,7 @@
               <w:rPr>
                 <w:rFonts w:ascii="Consolas" w:hAnsi="Consolas"/>
                 <w:color w:val="1F2937"/>
-                <w:sz w:val="16"/>
+                <w:sz w:val="14"/>
               </w:rPr>
               <w:t>│   │   ├── netconfig.rs          NetworkManager: adapters, IP editing, Wi-Fi</w:t>
               <w:br/>
@@ -4515,7 +4695,7 @@
               <w:rPr>
                 <w:rFonts w:ascii="Consolas" w:hAnsi="Consolas"/>
                 <w:color w:val="1F2937"/>
-                <w:sz w:val="16"/>
+                <w:sz w:val="14"/>
               </w:rPr>
               <w:t>│   │   ├── nettools.rs           ping, tracepath, DNS lookup, port check</w:t>
               <w:br/>
@@ -4524,7 +4704,7 @@
               <w:rPr>
                 <w:rFonts w:ascii="Consolas" w:hAnsi="Consolas"/>
                 <w:color w:val="1F2937"/>
-                <w:sz w:val="16"/>
+                <w:sz w:val="14"/>
               </w:rPr>
               <w:t>│   │   ├── netperf/              speed test: mod.rs (protocol), server.rs, client.rs</w:t>
               <w:br/>
@@ -4533,7 +4713,7 @@
               <w:rPr>
                 <w:rFonts w:ascii="Consolas" w:hAnsi="Consolas"/>
                 <w:color w:val="1F2937"/>
-                <w:sz w:val="16"/>
+                <w:sz w:val="14"/>
               </w:rPr>
               <w:t>│   │   ├── forge/                PacketForge: mod.rs (sessions), links.rs, serial.rs, encode.rs</w:t>
               <w:br/>
@@ -4542,7 +4722,7 @@
               <w:rPr>
                 <w:rFonts w:ascii="Consolas" w:hAnsi="Consolas"/>
                 <w:color w:val="1F2937"/>
-                <w:sz w:val="16"/>
+                <w:sz w:val="14"/>
               </w:rPr>
               <w:t>│   │   ├── recorder/             screen recorder: mod.rs (pipeline), sources.rs</w:t>
               <w:br/>
@@ -4551,7 +4731,16 @@
               <w:rPr>
                 <w:rFonts w:ascii="Consolas" w:hAnsi="Consolas"/>
                 <w:color w:val="1F2937"/>
-                <w:sz w:val="16"/>
+                <w:sz w:val="14"/>
+              </w:rPr>
+              <w:t>│   │   ├── launcher/             App Launchers: mod.rs (scan, checks, entry), install.rs, icon.rs</w:t>
+              <w:br/>
+            </w:r>
+            <w:r>
+              <w:rPr>
+                <w:rFonts w:ascii="Consolas" w:hAnsi="Consolas"/>
+                <w:color w:val="1F2937"/>
+                <w:sz w:val="14"/>
               </w:rPr>
               <w:t>│   │   ├── netlens/              packet analyzer: mod.rs (engine), capture.rs, sniffer.rs,</w:t>
               <w:br/>
@@ -4560,7 +4749,7 @@
               <w:rPr>
                 <w:rFonts w:ascii="Consolas" w:hAnsi="Consolas"/>
                 <w:color w:val="1F2937"/>
-                <w:sz w:val="16"/>
+                <w:sz w:val="14"/>
               </w:rPr>
               <w:t>│   │   │                         pcapfile.rs, filter.rs, store.rs, views.rs, explain.rs,</w:t>
               <w:br/>
@@ -4569,7 +4758,7 @@
               <w:rPr>
                 <w:rFonts w:ascii="Consolas" w:hAnsi="Consolas"/>
                 <w:color w:val="1F2937"/>
-                <w:sz w:val="16"/>
+                <w:sz w:val="14"/>
               </w:rPr>
               <w:t>│   │   │                         procmap.rs, wireshark.rs, dissect/{mod,net,web,media,dns}.rs</w:t>
               <w:br/>
@@ -4578,7 +4767,7 @@
               <w:rPr>
                 <w:rFonts w:ascii="Consolas" w:hAnsi="Consolas"/>
                 <w:color w:val="1F2937"/>
-                <w:sz w:val="16"/>
+                <w:sz w:val="14"/>
               </w:rPr>
               <w:t>│   │   └── privileged.rs         helper protocol, pkexec launcher, executor</w:t>
               <w:br/>
@@ -4587,7 +4776,7 @@
               <w:rPr>
                 <w:rFonts w:ascii="Consolas" w:hAnsi="Consolas"/>
                 <w:color w:val="1F2937"/>
-                <w:sz w:val="16"/>
+                <w:sz w:val="14"/>
               </w:rPr>
               <w:t>│   └── examples/                 dump, phase2, phase3, netperf, netcfg_selftest, rec_check</w:t>
               <w:br/>
@@ -4596,7 +4785,7 @@
               <w:rPr>
                 <w:rFonts w:ascii="Consolas" w:hAnsi="Consolas"/>
                 <w:color w:val="1F2937"/>
-                <w:sz w:val="16"/>
+                <w:sz w:val="14"/>
               </w:rPr>
               <w:t>├── src-tauri/                    desktop application</w:t>
               <w:br/>
@@ -4605,7 +4794,7 @@
               <w:rPr>
                 <w:rFonts w:ascii="Consolas" w:hAnsi="Consolas"/>
                 <w:color w:val="1F2937"/>
-                <w:sz w:val="16"/>
+                <w:sz w:val="14"/>
               </w:rPr>
               <w:t>│   ├── tauri.conf.json           window, bundle, deb dependencies, polkit file</w:t>
               <w:br/>
@@ -4614,7 +4803,7 @@
               <w:rPr>
                 <w:rFonts w:ascii="Consolas" w:hAnsi="Consolas"/>
                 <w:color w:val="1F2937"/>
-                <w:sz w:val="16"/>
+                <w:sz w:val="14"/>
               </w:rPr>
               <w:t>│   ├── capabilities/             default.json (main window), region.json (region picker)</w:t>
               <w:br/>
@@ -4623,7 +4812,7 @@
               <w:rPr>
                 <w:rFonts w:ascii="Consolas" w:hAnsi="Consolas"/>
                 <w:color w:val="1F2937"/>
-                <w:sz w:val="16"/>
+                <w:sz w:val="14"/>
               </w:rPr>
               <w:t>│   └── src/</w:t>
               <w:br/>
@@ -4632,7 +4821,7 @@
               <w:rPr>
                 <w:rFonts w:ascii="Consolas" w:hAnsi="Consolas"/>
                 <w:color w:val="1F2937"/>
-                <w:sz w:val="16"/>
+                <w:sz w:val="14"/>
               </w:rPr>
               <w:t>│       ├── main.rs               builder, plugins, setup, command registry, exit hook</w:t>
               <w:br/>
@@ -4641,7 +4830,7 @@
               <w:rPr>
                 <w:rFonts w:ascii="Consolas" w:hAnsi="Consolas"/>
                 <w:color w:val="1F2937"/>
-                <w:sz w:val="16"/>
+                <w:sz w:val="14"/>
               </w:rPr>
               <w:t>│       ├── state.rs              shared state, telemetry thread, alert config</w:t>
               <w:br/>
@@ -4650,7 +4839,7 @@
               <w:rPr>
                 <w:rFonts w:ascii="Consolas" w:hAnsi="Consolas"/>
                 <w:color w:val="1F2937"/>
-                <w:sz w:val="16"/>
+                <w:sz w:val="14"/>
               </w:rPr>
               <w:t>│       ├── commands.rs           monitor / process commands, blocking() helper</w:t>
               <w:br/>
@@ -4659,7 +4848,7 @@
               <w:rPr>
                 <w:rFonts w:ascii="Consolas" w:hAnsi="Consolas"/>
                 <w:color w:val="1F2937"/>
-                <w:sz w:val="16"/>
+                <w:sz w:val="14"/>
               </w:rPr>
               <w:t>│       ├── maintenance.rs        software, cleaner, large files</w:t>
               <w:br/>
@@ -4668,7 +4857,7 @@
               <w:rPr>
                 <w:rFonts w:ascii="Consolas" w:hAnsi="Consolas"/>
                 <w:color w:val="1F2937"/>
-                <w:sz w:val="16"/>
+                <w:sz w:val="14"/>
               </w:rPr>
               <w:t>│       ├── tools.rs              search, services, startup, connections, alerts, export</w:t>
               <w:br/>
@@ -4677,7 +4866,7 @@
               <w:rPr>
                 <w:rFonts w:ascii="Consolas" w:hAnsi="Consolas"/>
                 <w:color w:val="1F2937"/>
-                <w:sz w:val="16"/>
+                <w:sz w:val="14"/>
               </w:rPr>
               <w:t>│       ├── network.rs            network settings, tools, speed test</w:t>
               <w:br/>
@@ -4686,7 +4875,7 @@
               <w:rPr>
                 <w:rFonts w:ascii="Consolas" w:hAnsi="Consolas"/>
                 <w:color w:val="1F2937"/>
-                <w:sz w:val="16"/>
+                <w:sz w:val="14"/>
               </w:rPr>
               <w:t>│       ├── forge.rs              PacketForge commands + event batcher</w:t>
               <w:br/>
@@ -4695,7 +4884,7 @@
               <w:rPr>
                 <w:rFonts w:ascii="Consolas" w:hAnsi="Consolas"/>
                 <w:color w:val="1F2937"/>
-                <w:sz w:val="16"/>
+                <w:sz w:val="14"/>
               </w:rPr>
               <w:t>│       ├── recorder.rs           recorder commands, tray, hotkeys, region picker</w:t>
               <w:br/>
@@ -4704,7 +4893,7 @@
               <w:rPr>
                 <w:rFonts w:ascii="Consolas" w:hAnsi="Consolas"/>
                 <w:color w:val="1F2937"/>
-                <w:sz w:val="16"/>
+                <w:sz w:val="14"/>
               </w:rPr>
               <w:t>│       ├── netlens.rs            NetLens commands</w:t>
               <w:br/>
@@ -4713,7 +4902,16 @@
               <w:rPr>
                 <w:rFonts w:ascii="Consolas" w:hAnsi="Consolas"/>
                 <w:color w:val="1F2937"/>
-                <w:sz w:val="16"/>
+                <w:sz w:val="14"/>
+              </w:rPr>
+              <w:t>│       ├── launchers.rs          App Launchers commands + registry</w:t>
+              <w:br/>
+            </w:r>
+            <w:r>
+              <w:rPr>
+                <w:rFonts w:ascii="Consolas" w:hAnsi="Consolas"/>
+                <w:color w:val="1F2937"/>
+                <w:sz w:val="14"/>
               </w:rPr>
               <w:t>│       ├── bin/syspulse-helper.rs privileged helper binary</w:t>
               <w:br/>
@@ -4722,7 +4920,7 @@
               <w:rPr>
                 <w:rFonts w:ascii="Consolas" w:hAnsi="Consolas"/>
                 <w:color w:val="1F2937"/>
-                <w:sz w:val="16"/>
+                <w:sz w:val="14"/>
               </w:rPr>
               <w:t>│       └── bin/syspulse-capture.rs packet-capture helper binary</w:t>
               <w:br/>
@@ -4731,7 +4929,7 @@
               <w:rPr>
                 <w:rFonts w:ascii="Consolas" w:hAnsi="Consolas"/>
                 <w:color w:val="1F2937"/>
-                <w:sz w:val="16"/>
+                <w:sz w:val="14"/>
               </w:rPr>
               <w:t>├── ui/                           Svelte frontend</w:t>
               <w:br/>
@@ -4740,7 +4938,7 @@
               <w:rPr>
                 <w:rFonts w:ascii="Consolas" w:hAnsi="Consolas"/>
                 <w:color w:val="1F2937"/>
-                <w:sz w:val="16"/>
+                <w:sz w:val="14"/>
               </w:rPr>
               <w:t>│   └── src/</w:t>
               <w:br/>
@@ -4749,7 +4947,7 @@
               <w:rPr>
                 <w:rFonts w:ascii="Consolas" w:hAnsi="Consolas"/>
                 <w:color w:val="1F2937"/>
-                <w:sz w:val="16"/>
+                <w:sz w:val="14"/>
               </w:rPr>
               <w:t>│       ├── main.ts               mounts App (or RegionPicker for #region)</w:t>
               <w:br/>
@@ -4758,7 +4956,7 @@
               <w:rPr>
                 <w:rFonts w:ascii="Consolas" w:hAnsi="Consolas"/>
                 <w:color w:val="1F2937"/>
-                <w:sz w:val="16"/>
+                <w:sz w:val="14"/>
               </w:rPr>
               <w:t>│       ├── App.svelte            shell: sidebar, router, toasts</w:t>
               <w:br/>
@@ -4767,7 +4965,7 @@
               <w:rPr>
                 <w:rFonts w:ascii="Consolas" w:hAnsi="Consolas"/>
                 <w:color w:val="1F2937"/>
-                <w:sz w:val="16"/>
+                <w:sz w:val="14"/>
               </w:rPr>
               <w:t>│       ├── app.css               design tokens (dark/light), base styles</w:t>
               <w:br/>
@@ -4776,7 +4974,7 @@
               <w:rPr>
                 <w:rFonts w:ascii="Consolas" w:hAnsi="Consolas"/>
                 <w:color w:val="1F2937"/>
-                <w:sz w:val="16"/>
+                <w:sz w:val="14"/>
               </w:rPr>
               <w:t>│       ├── lib/                  api.ts, types.ts, stores.svelte.ts, format.ts, mock.ts,</w:t>
               <w:br/>
@@ -4785,7 +4983,7 @@
               <w:rPr>
                 <w:rFonts w:ascii="Consolas" w:hAnsi="Consolas"/>
                 <w:color w:val="1F2937"/>
-                <w:sz w:val="16"/>
+                <w:sz w:val="14"/>
               </w:rPr>
               <w:t>│       │                         forge.svelte.ts, forgefmt.ts, recorder.ts, netlens.ts</w:t>
               <w:br/>
@@ -4794,7 +4992,7 @@
               <w:rPr>
                 <w:rFonts w:ascii="Consolas" w:hAnsi="Consolas"/>
                 <w:color w:val="1F2937"/>
-                <w:sz w:val="16"/>
+                <w:sz w:val="14"/>
               </w:rPr>
               <w:t>│       ├── lib/components/       Card, Gauge, LineChart, Sparkline, Meter, Stat, Status,</w:t>
               <w:br/>
@@ -4803,7 +5001,7 @@
               <w:rPr>
                 <w:rFonts w:ascii="Consolas" w:hAnsi="Consolas"/>
                 <w:color w:val="1F2937"/>
-                <w:sz w:val="16"/>
+                <w:sz w:val="14"/>
               </w:rPr>
               <w:t>│       │                         Icon, Modal, Toasts, PageHeader, AppIcon, Treemap,</w:t>
               <w:br/>
@@ -4812,7 +5010,7 @@
               <w:rPr>
                 <w:rFonts w:ascii="Consolas" w:hAnsi="Consolas"/>
                 <w:color w:val="1F2937"/>
-                <w:sz w:val="16"/>
+                <w:sz w:val="14"/>
               </w:rPr>
               <w:t>│       │                         ForgeLog, ComingSoon, netlens/{PacketList, DetailTree,</w:t>
               <w:br/>
@@ -4821,7 +5019,7 @@
               <w:rPr>
                 <w:rFonts w:ascii="Consolas" w:hAnsi="Consolas"/>
                 <w:color w:val="1F2937"/>
-                <w:sz w:val="16"/>
+                <w:sz w:val="14"/>
               </w:rPr>
               <w:t>│       │                         HexView, FollowStream}</w:t>
               <w:br/>
@@ -4830,16 +5028,16 @@
               <w:rPr>
                 <w:rFonts w:ascii="Consolas" w:hAnsi="Consolas"/>
                 <w:color w:val="1F2937"/>
-                <w:sz w:val="16"/>
-              </w:rPr>
-              <w:t>│       └── pages/                one Svelte file per page (20)</w:t>
+                <w:sz w:val="14"/>
+              </w:rPr>
+              <w:t>│       └── pages/                one Svelte file per page (21)</w:t>
               <w:br/>
             </w:r>
             <w:r>
               <w:rPr>
                 <w:rFonts w:ascii="Consolas" w:hAnsi="Consolas"/>
                 <w:color w:val="1F2937"/>
-                <w:sz w:val="16"/>
+                <w:sz w:val="14"/>
               </w:rPr>
               <w:t>├── packaging/linux/              polkit policy</w:t>
               <w:br/>
@@ -4848,7 +5046,7 @@
               <w:rPr>
                 <w:rFonts w:ascii="Consolas" w:hAnsi="Consolas"/>
                 <w:color w:val="1F2937"/>
-                <w:sz w:val="16"/>
+                <w:sz w:val="14"/>
               </w:rPr>
               <w:t>├── scripts/setup-dev-ubuntu.sh   developer environment setup</w:t>
               <w:br/>
@@ -4857,7 +5055,7 @@
               <w:rPr>
                 <w:rFonts w:ascii="Consolas" w:hAnsi="Consolas"/>
                 <w:color w:val="1F2937"/>
-                <w:sz w:val="16"/>
+                <w:sz w:val="14"/>
               </w:rPr>
               <w:t>└── docs/                         INSTALL, ARCHITECTURE, USER_MANUAL, ROADMAP</w:t>
             </w:r>
@@ -7672,7 +7870,7 @@
               </w:rPr>
               <w:t xml:space="preserve">iperf-style speed test — see </w:t>
             </w:r>
-            <w:hyperlink w:anchor="sec22">
+            <w:hyperlink w:anchor="sec23">
               <w:r>
                 <w:rPr>
                   <w:color w:val="1F6FEB"/>
@@ -8067,7 +8265,7 @@
               </w:rPr>
               <w:t xml:space="preserve">, hex in any common notation), line endings, checksums — see </w:t>
             </w:r>
-            <w:hyperlink w:anchor="sec23">
+            <w:hyperlink w:anchor="sec24">
               <w:r>
                 <w:rPr>
                   <w:color w:val="1F6FEB"/>
@@ -8674,6 +8872,28 @@
         <w:t>setCaptureAccess</w:t>
       </w:r>
       <w:r>
+        <w:t xml:space="preserve">, </w:t>
+      </w:r>
+      <w:r>
+        <w:rPr>
+          <w:rFonts w:ascii="Consolas" w:hAnsi="Consolas"/>
+          <w:sz w:val="19"/>
+          <w:shd w:val="clear" w:fill="EEF1F5"/>
+        </w:rPr>
+        <w:t>installLauncher</w:t>
+      </w:r>
+      <w:r>
+        <w:t xml:space="preserve">, </w:t>
+      </w:r>
+      <w:r>
+        <w:rPr>
+          <w:rFonts w:ascii="Consolas" w:hAnsi="Consolas"/>
+          <w:sz w:val="19"/>
+          <w:shd w:val="clear" w:fill="EEF1F5"/>
+        </w:rPr>
+        <w:t>removeLauncher</w:t>
+      </w:r>
+      <w:r>
         <w:t>.</w:t>
       </w:r>
     </w:p>
@@ -8737,7 +8957,7 @@
       <w:r>
         <w:t xml:space="preserve"> validates every argument again, as root. See </w:t>
       </w:r>
-      <w:hyperlink w:anchor="sec20">
+      <w:hyperlink w:anchor="sec21">
         <w:r>
           <w:rPr>
             <w:color w:val="1F6FEB"/>
@@ -9959,6 +10179,621 @@
     <w:p>
       <w:bookmarkStart w:id="14" w:name="sec14"/>
       <w:pPr>
+        <w:pStyle w:val="Heading2"/>
+      </w:pPr>
+      <w:r>
+        <w:t>5.9 App Launchers (</w:t>
+      </w:r>
+      <w:r>
+        <w:rPr>
+          <w:rFonts w:ascii="Consolas" w:hAnsi="Consolas"/>
+          <w:sz w:val="19"/>
+          <w:shd w:val="clear" w:fill="EEF1F5"/>
+        </w:rPr>
+        <w:t>launcher</w:t>
+      </w:r>
+      <w:r>
+        <w:t>)</w:t>
+      </w:r>
+      <w:bookmarkEnd w:id="14"/>
+    </w:p>
+    <w:tbl>
+      <w:tblPr>
+        <w:tblW w:type="auto" w:w="0"/>
+        <w:jc w:val="center"/>
+        <w:tblLook w:firstColumn="1" w:firstRow="1" w:lastColumn="0" w:lastRow="0" w:noHBand="0" w:noVBand="1" w:val="04A0"/>
+        <w:tblBorders>
+          <w:top w:val="single" w:sz="4" w:space="0" w:color="D0D7DE"/>
+          <w:left w:val="single" w:sz="4" w:space="0" w:color="D0D7DE"/>
+          <w:bottom w:val="single" w:sz="4" w:space="0" w:color="D0D7DE"/>
+          <w:right w:val="single" w:sz="4" w:space="0" w:color="D0D7DE"/>
+          <w:insideH w:val="single" w:sz="4" w:space="0" w:color="D0D7DE"/>
+          <w:insideV w:val="single" w:sz="4" w:space="0" w:color="D0D7DE"/>
+        </w:tblBorders>
+      </w:tblPr>
+      <w:tblGrid>
+        <w:gridCol w:w="4819"/>
+        <w:gridCol w:w="4819"/>
+      </w:tblGrid>
+      <w:tr>
+        <w:trPr>
+          <w:tblHeader w:val="true"/>
+        </w:trPr>
+        <w:tc>
+          <w:tcPr>
+            <w:tcW w:type="dxa" w:w="1377"/>
+            <w:tcMar>
+              <w:top w:w="60" w:type="dxa"/>
+              <w:bottom w:w="60" w:type="dxa"/>
+              <w:start w:w="100" w:type="dxa"/>
+              <w:end w:w="100" w:type="dxa"/>
+            </w:tcMar>
+            <w:shd w:val="clear" w:color="auto" w:fill="1F6FEB"/>
+          </w:tcPr>
+          <w:p>
+            <w:pPr>
+              <w:spacing w:after="0" w:line="252" w:lineRule="auto"/>
+            </w:pPr>
+            <w:r>
+              <w:rPr>
+                <w:b/>
+                <w:color w:val="FFFFFF"/>
+                <w:sz w:val="19"/>
+              </w:rPr>
+              <w:t>File</w:t>
+            </w:r>
+          </w:p>
+        </w:tc>
+        <w:tc>
+          <w:tcPr>
+            <w:tcW w:type="dxa" w:w="8261"/>
+            <w:tcMar>
+              <w:top w:w="60" w:type="dxa"/>
+              <w:bottom w:w="60" w:type="dxa"/>
+              <w:start w:w="100" w:type="dxa"/>
+              <w:end w:w="100" w:type="dxa"/>
+            </w:tcMar>
+            <w:shd w:val="clear" w:color="auto" w:fill="1F6FEB"/>
+          </w:tcPr>
+          <w:p>
+            <w:pPr>
+              <w:spacing w:after="0" w:line="252" w:lineRule="auto"/>
+            </w:pPr>
+            <w:r>
+              <w:rPr>
+                <w:b/>
+                <w:color w:val="FFFFFF"/>
+                <w:sz w:val="19"/>
+              </w:rPr>
+              <w:t>Responsibility</w:t>
+            </w:r>
+          </w:p>
+        </w:tc>
+      </w:tr>
+      <w:tr>
+        <w:tc>
+          <w:tcPr>
+            <w:tcW w:type="dxa" w:w="1377"/>
+            <w:tcMar>
+              <w:top w:w="60" w:type="dxa"/>
+              <w:bottom w:w="60" w:type="dxa"/>
+              <w:start w:w="100" w:type="dxa"/>
+              <w:end w:w="100" w:type="dxa"/>
+            </w:tcMar>
+          </w:tcPr>
+          <w:p>
+            <w:pPr>
+              <w:spacing w:after="0" w:line="252" w:lineRule="auto"/>
+            </w:pPr>
+            <w:r>
+              <w:rPr>
+                <w:rFonts w:ascii="Consolas" w:hAnsi="Consolas"/>
+                <w:b/>
+                <w:sz w:val="17"/>
+                <w:shd w:val="clear" w:fill="EEF1F5"/>
+              </w:rPr>
+              <w:t>mod.rs</w:t>
+            </w:r>
+          </w:p>
+        </w:tc>
+        <w:tc>
+          <w:tcPr>
+            <w:tcW w:type="dxa" w:w="8261"/>
+            <w:tcMar>
+              <w:top w:w="60" w:type="dxa"/>
+              <w:bottom w:w="60" w:type="dxa"/>
+              <w:start w:w="100" w:type="dxa"/>
+              <w:end w:w="100" w:type="dxa"/>
+            </w:tcMar>
+          </w:tcPr>
+          <w:p>
+            <w:pPr>
+              <w:spacing w:after="0" w:line="252" w:lineRule="auto"/>
+            </w:pPr>
+            <w:r>
+              <w:rPr>
+                <w:b/>
+                <w:sz w:val="19"/>
+              </w:rPr>
+              <w:t>Scan</w:t>
+            </w:r>
+            <w:r>
+              <w:rPr>
+                <w:sz w:val="19"/>
+              </w:rPr>
+              <w:t xml:space="preserve"> an application folder (≤ 50,000 entries): ELF parsing (machine type; PIE executable vs shared library via </w:t>
+            </w:r>
+            <w:r>
+              <w:rPr>
+                <w:rFonts w:ascii="Consolas" w:hAnsi="Consolas"/>
+                <w:sz w:val="17"/>
+                <w:shd w:val="clear" w:fill="EEF1F5"/>
+              </w:rPr>
+              <w:t>PT_INTERP</w:t>
+            </w:r>
+            <w:r>
+              <w:rPr>
+                <w:sz w:val="19"/>
+              </w:rPr>
+              <w:t>), AppImages, scripts (</w:t>
+            </w:r>
+            <w:r>
+              <w:rPr>
+                <w:rFonts w:ascii="Consolas" w:hAnsi="Consolas"/>
+                <w:sz w:val="17"/>
+                <w:shd w:val="clear" w:fill="EEF1F5"/>
+              </w:rPr>
+              <w:t>#!</w:t>
+            </w:r>
+            <w:r>
+              <w:rPr>
+                <w:sz w:val="19"/>
+              </w:rPr>
+              <w:t>), Python entry points (</w:t>
+            </w:r>
+            <w:r>
+              <w:rPr>
+                <w:rFonts w:ascii="Consolas" w:hAnsi="Consolas"/>
+                <w:sz w:val="17"/>
+                <w:shd w:val="clear" w:fill="EEF1F5"/>
+              </w:rPr>
+              <w:t>__main__</w:t>
+            </w:r>
+            <w:r>
+              <w:rPr>
+                <w:sz w:val="19"/>
+              </w:rPr>
+              <w:t>), jars; ranking by depth, name similarity, execute bit and penalties (install/uninstall/test…); icons with previews; bundled library folders (</w:t>
+            </w:r>
+            <w:r>
+              <w:rPr>
+                <w:rFonts w:ascii="Consolas" w:hAnsi="Consolas"/>
+                <w:sz w:val="17"/>
+                <w:shd w:val="clear" w:fill="EEF1F5"/>
+              </w:rPr>
+              <w:t>LD_LIBRARY_PATH</w:t>
+            </w:r>
+            <w:r>
+              <w:rPr>
+                <w:sz w:val="19"/>
+              </w:rPr>
+              <w:t>), Qt plugin folder (</w:t>
+            </w:r>
+            <w:r>
+              <w:rPr>
+                <w:rFonts w:ascii="Consolas" w:hAnsi="Consolas"/>
+                <w:sz w:val="17"/>
+                <w:shd w:val="clear" w:fill="EEF1F5"/>
+              </w:rPr>
+              <w:t>QT_PLUGIN_PATH</w:t>
+            </w:r>
+            <w:r>
+              <w:rPr>
+                <w:sz w:val="19"/>
+              </w:rPr>
+              <w:t xml:space="preserve">), Python venv. </w:t>
+            </w:r>
+            <w:r>
+              <w:rPr>
+                <w:b/>
+                <w:sz w:val="19"/>
+              </w:rPr>
+              <w:t>Users</w:t>
+            </w:r>
+            <w:r>
+              <w:rPr>
+                <w:sz w:val="19"/>
+              </w:rPr>
+              <w:t xml:space="preserve"> from </w:t>
+            </w:r>
+            <w:r>
+              <w:rPr>
+                <w:rFonts w:ascii="Consolas" w:hAnsi="Consolas"/>
+                <w:sz w:val="17"/>
+                <w:shd w:val="clear" w:fill="EEF1F5"/>
+              </w:rPr>
+              <w:t>/etc/passwd</w:t>
+            </w:r>
+            <w:r>
+              <w:rPr>
+                <w:sz w:val="19"/>
+              </w:rPr>
+              <w:t xml:space="preserve"> (uid 1000–59999, real shell; logged in = </w:t>
+            </w:r>
+            <w:r>
+              <w:rPr>
+                <w:rFonts w:ascii="Consolas" w:hAnsi="Consolas"/>
+                <w:sz w:val="17"/>
+                <w:shd w:val="clear" w:fill="EEF1F5"/>
+              </w:rPr>
+              <w:t>/run/user/&lt;uid&gt;</w:t>
+            </w:r>
+            <w:r>
+              <w:rPr>
+                <w:sz w:val="19"/>
+              </w:rPr>
+              <w:t xml:space="preserve"> exists; admin = sudo/admin group). </w:t>
+            </w:r>
+            <w:r>
+              <w:rPr>
+                <w:b/>
+                <w:sz w:val="19"/>
+              </w:rPr>
+              <w:t>Check</w:t>
+            </w:r>
+            <w:r>
+              <w:rPr>
+                <w:sz w:val="19"/>
+              </w:rPr>
+              <w:t>: per-user path traversal with mode bits, groups and ACL entries (</w:t>
+            </w:r>
+            <w:r>
+              <w:rPr>
+                <w:rFonts w:ascii="Consolas" w:hAnsi="Consolas"/>
+                <w:sz w:val="17"/>
+                <w:shd w:val="clear" w:fill="EEF1F5"/>
+              </w:rPr>
+              <w:t>getfacl</w:t>
+            </w:r>
+            <w:r>
+              <w:rPr>
+                <w:sz w:val="19"/>
+              </w:rPr>
+              <w:t>), missing libraries (</w:t>
+            </w:r>
+            <w:r>
+              <w:rPr>
+                <w:rFonts w:ascii="Consolas" w:hAnsi="Consolas"/>
+                <w:sz w:val="17"/>
+                <w:shd w:val="clear" w:fill="EEF1F5"/>
+              </w:rPr>
+              <w:t>ldd</w:t>
+            </w:r>
+            <w:r>
+              <w:rPr>
+                <w:sz w:val="19"/>
+              </w:rPr>
+              <w:t xml:space="preserve"> with the launcher's library path), architecture, interpreters, desktop-file validation. </w:t>
+            </w:r>
+            <w:r>
+              <w:rPr>
+                <w:b/>
+                <w:sz w:val="19"/>
+              </w:rPr>
+              <w:t>Entry</w:t>
+            </w:r>
+            <w:r>
+              <w:rPr>
+                <w:sz w:val="19"/>
+              </w:rPr>
+              <w:t xml:space="preserve">: Desktop Entry rendering with spec-correct </w:t>
+            </w:r>
+            <w:r>
+              <w:rPr>
+                <w:rFonts w:ascii="Consolas" w:hAnsi="Consolas"/>
+                <w:sz w:val="17"/>
+                <w:shd w:val="clear" w:fill="EEF1F5"/>
+              </w:rPr>
+              <w:t>Exec</w:t>
+            </w:r>
+            <w:r>
+              <w:rPr>
+                <w:sz w:val="19"/>
+              </w:rPr>
+              <w:t xml:space="preserve"> quoting (reserved characters, </w:t>
+            </w:r>
+            <w:r>
+              <w:rPr>
+                <w:rFonts w:ascii="Consolas" w:hAnsi="Consolas"/>
+                <w:sz w:val="17"/>
+                <w:shd w:val="clear" w:fill="EEF1F5"/>
+              </w:rPr>
+              <w:t>\\</w:t>
+            </w:r>
+            <w:r>
+              <w:rPr>
+                <w:sz w:val="19"/>
+              </w:rPr>
+              <w:t xml:space="preserve"> rule, </w:t>
+            </w:r>
+            <w:r>
+              <w:rPr>
+                <w:rFonts w:ascii="Consolas" w:hAnsi="Consolas"/>
+                <w:sz w:val="17"/>
+                <w:shd w:val="clear" w:fill="EEF1F5"/>
+              </w:rPr>
+              <w:t>%%</w:t>
+            </w:r>
+            <w:r>
+              <w:rPr>
+                <w:sz w:val="19"/>
+              </w:rPr>
+              <w:t>)</w:t>
+            </w:r>
+          </w:p>
+        </w:tc>
+      </w:tr>
+      <w:tr>
+        <w:tc>
+          <w:tcPr>
+            <w:tcW w:type="dxa" w:w="1377"/>
+            <w:tcMar>
+              <w:top w:w="60" w:type="dxa"/>
+              <w:bottom w:w="60" w:type="dxa"/>
+              <w:start w:w="100" w:type="dxa"/>
+              <w:end w:w="100" w:type="dxa"/>
+            </w:tcMar>
+            <w:shd w:val="clear" w:color="auto" w:fill="F3F6FB"/>
+          </w:tcPr>
+          <w:p>
+            <w:pPr>
+              <w:spacing w:after="0" w:line="252" w:lineRule="auto"/>
+            </w:pPr>
+            <w:r>
+              <w:rPr>
+                <w:rFonts w:ascii="Consolas" w:hAnsi="Consolas"/>
+                <w:b/>
+                <w:sz w:val="17"/>
+                <w:shd w:val="clear" w:fill="EEF1F5"/>
+              </w:rPr>
+              <w:t>install.rs</w:t>
+            </w:r>
+          </w:p>
+        </w:tc>
+        <w:tc>
+          <w:tcPr>
+            <w:tcW w:type="dxa" w:w="8261"/>
+            <w:tcMar>
+              <w:top w:w="60" w:type="dxa"/>
+              <w:bottom w:w="60" w:type="dxa"/>
+              <w:start w:w="100" w:type="dxa"/>
+              <w:end w:w="100" w:type="dxa"/>
+            </w:tcMar>
+            <w:shd w:val="clear" w:color="auto" w:fill="F3F6FB"/>
+          </w:tcPr>
+          <w:p>
+            <w:pPr>
+              <w:spacing w:after="0" w:line="252" w:lineRule="auto"/>
+            </w:pPr>
+            <w:r>
+              <w:rPr>
+                <w:sz w:val="19"/>
+              </w:rPr>
+              <w:t xml:space="preserve">Per-user install/remove. Direct mode for the current account; root mode inside the helper, where </w:t>
+            </w:r>
+            <w:r>
+              <w:rPr>
+                <w:b/>
+                <w:sz w:val="19"/>
+              </w:rPr>
+              <w:t xml:space="preserve">every file in a user's home is written by a </w:t>
+            </w:r>
+            <w:r>
+              <w:rPr>
+                <w:rFonts w:ascii="Consolas" w:hAnsi="Consolas"/>
+                <w:b/>
+                <w:sz w:val="17"/>
+                <w:shd w:val="clear" w:fill="EEF1F5"/>
+              </w:rPr>
+              <w:t>runuser -u &lt;user&gt;</w:t>
+            </w:r>
+            <w:r>
+              <w:rPr>
+                <w:b/>
+                <w:sz w:val="19"/>
+              </w:rPr>
+              <w:t xml:space="preserve"> child</w:t>
+            </w:r>
+            <w:r>
+              <w:rPr>
+                <w:sz w:val="19"/>
+              </w:rPr>
+              <w:t xml:space="preserve"> (no root writes into homes, no symlink redirection). D-Bus work (</w:t>
+            </w:r>
+            <w:r>
+              <w:rPr>
+                <w:rFonts w:ascii="Consolas" w:hAnsi="Consolas"/>
+                <w:sz w:val="17"/>
+                <w:shd w:val="clear" w:fill="EEF1F5"/>
+              </w:rPr>
+              <w:t>gio set metadata::trusted</w:t>
+            </w:r>
+            <w:r>
+              <w:rPr>
+                <w:sz w:val="19"/>
+              </w:rPr>
+              <w:t xml:space="preserve">, </w:t>
+            </w:r>
+            <w:r>
+              <w:rPr>
+                <w:rFonts w:ascii="Consolas" w:hAnsi="Consolas"/>
+                <w:sz w:val="17"/>
+                <w:shd w:val="clear" w:fill="EEF1F5"/>
+              </w:rPr>
+              <w:t>gsettings</w:t>
+            </w:r>
+            <w:r>
+              <w:rPr>
+                <w:sz w:val="19"/>
+              </w:rPr>
+              <w:t xml:space="preserve"> favourites) uses the user's session bus when logged in, otherwise </w:t>
+            </w:r>
+            <w:r>
+              <w:rPr>
+                <w:rFonts w:ascii="Consolas" w:hAnsi="Consolas"/>
+                <w:sz w:val="17"/>
+                <w:shd w:val="clear" w:fill="EEF1F5"/>
+              </w:rPr>
+              <w:t>dbus-run-session</w:t>
+            </w:r>
+            <w:r>
+              <w:rPr>
+                <w:sz w:val="19"/>
+              </w:rPr>
+              <w:t>. Root itself only adds the program's execute bit and ACLs (</w:t>
+            </w:r>
+            <w:r>
+              <w:rPr>
+                <w:rFonts w:ascii="Consolas" w:hAnsi="Consolas"/>
+                <w:sz w:val="17"/>
+                <w:shd w:val="clear" w:fill="EEF1F5"/>
+              </w:rPr>
+              <w:t>setfacl -m u:&lt;user&gt;:--x</w:t>
+            </w:r>
+            <w:r>
+              <w:rPr>
+                <w:sz w:val="19"/>
+              </w:rPr>
+              <w:t xml:space="preserve"> on blocking parents, </w:t>
+            </w:r>
+            <w:r>
+              <w:rPr>
+                <w:rFonts w:ascii="Consolas" w:hAnsi="Consolas"/>
+                <w:sz w:val="17"/>
+                <w:shd w:val="clear" w:fill="EEF1F5"/>
+              </w:rPr>
+              <w:t>-R -P</w:t>
+            </w:r>
+            <w:r>
+              <w:rPr>
+                <w:sz w:val="19"/>
+              </w:rPr>
+              <w:t xml:space="preserve"> and default </w:t>
+            </w:r>
+            <w:r>
+              <w:rPr>
+                <w:rFonts w:ascii="Consolas" w:hAnsi="Consolas"/>
+                <w:sz w:val="17"/>
+                <w:shd w:val="clear" w:fill="EEF1F5"/>
+              </w:rPr>
+              <w:t>rX</w:t>
+            </w:r>
+            <w:r>
+              <w:rPr>
+                <w:sz w:val="19"/>
+              </w:rPr>
+              <w:t>/</w:t>
+            </w:r>
+            <w:r>
+              <w:rPr>
+                <w:rFonts w:ascii="Consolas" w:hAnsi="Consolas"/>
+                <w:sz w:val="17"/>
+                <w:shd w:val="clear" w:fill="EEF1F5"/>
+              </w:rPr>
+              <w:t>rwX</w:t>
+            </w:r>
+            <w:r>
+              <w:rPr>
+                <w:sz w:val="19"/>
+              </w:rPr>
+              <w:t xml:space="preserve"> on the folder)</w:t>
+            </w:r>
+          </w:p>
+        </w:tc>
+      </w:tr>
+      <w:tr>
+        <w:tc>
+          <w:tcPr>
+            <w:tcW w:type="dxa" w:w="1377"/>
+            <w:tcMar>
+              <w:top w:w="60" w:type="dxa"/>
+              <w:bottom w:w="60" w:type="dxa"/>
+              <w:start w:w="100" w:type="dxa"/>
+              <w:end w:w="100" w:type="dxa"/>
+            </w:tcMar>
+          </w:tcPr>
+          <w:p>
+            <w:pPr>
+              <w:spacing w:after="0" w:line="252" w:lineRule="auto"/>
+            </w:pPr>
+            <w:r>
+              <w:rPr>
+                <w:rFonts w:ascii="Consolas" w:hAnsi="Consolas"/>
+                <w:b/>
+                <w:sz w:val="17"/>
+                <w:shd w:val="clear" w:fill="EEF1F5"/>
+              </w:rPr>
+              <w:t>icon.rs</w:t>
+            </w:r>
+          </w:p>
+        </w:tc>
+        <w:tc>
+          <w:tcPr>
+            <w:tcW w:type="dxa" w:w="8261"/>
+            <w:tcMar>
+              <w:top w:w="60" w:type="dxa"/>
+              <w:bottom w:w="60" w:type="dxa"/>
+              <w:start w:w="100" w:type="dxa"/>
+              <w:end w:w="100" w:type="dxa"/>
+            </w:tcMar>
+          </w:tcPr>
+          <w:p>
+            <w:pPr>
+              <w:spacing w:after="0" w:line="252" w:lineRule="auto"/>
+            </w:pPr>
+            <w:r>
+              <w:rPr>
+                <w:sz w:val="19"/>
+              </w:rPr>
+              <w:t>Previews (data URLs) and conversion of PNG/ICO/JPEG/BMP to a centred 256×256 PNG; SVG/XPM installed as-is after a format check</w:t>
+            </w:r>
+          </w:p>
+        </w:tc>
+      </w:tr>
+    </w:tbl>
+    <w:p>
+      <w:pPr>
+        <w:spacing w:after="40"/>
+      </w:pPr>
+    </w:p>
+    <w:p>
+      <w:r>
+        <w:t>The app keeps a registry (</w:t>
+      </w:r>
+      <w:r>
+        <w:rPr>
+          <w:rFonts w:ascii="Consolas" w:hAnsi="Consolas"/>
+          <w:sz w:val="19"/>
+          <w:shd w:val="clear" w:fill="EEF1F5"/>
+        </w:rPr>
+        <w:t>launchers.json</w:t>
+      </w:r>
+      <w:r>
+        <w:t xml:space="preserve">) with each spec, its users and the ACL parents added per user, so </w:t>
+      </w:r>
+      <w:r>
+        <w:rPr>
+          <w:b/>
+        </w:rPr>
+        <w:t>Remove</w:t>
+      </w:r>
+      <w:r>
+        <w:t xml:space="preserve"> can revoke exactly what was granted.</w:t>
+      </w:r>
+    </w:p>
+    <w:p>
+      <w:bookmarkStart w:id="15" w:name="sec15"/>
+      <w:pPr>
         <w:pStyle w:val="Heading1"/>
       </w:pPr>
       <w:r>
@@ -9975,7 +10810,7 @@
       <w:r>
         <w:t>)</w:t>
       </w:r>
-      <w:bookmarkEnd w:id="14"/>
+      <w:bookmarkEnd w:id="15"/>
     </w:p>
     <w:p>
       <w:r>
@@ -10699,7 +11534,7 @@
                 <w:sz w:val="17"/>
                 <w:shd w:val="clear" w:fill="EEF1F5"/>
               </w:rPr>
-              <w:t>bin/syspulse-capture.rs</w:t>
+              <w:t>launchers.rs</w:t>
             </w:r>
           </w:p>
         </w:tc>
@@ -10722,7 +11557,7 @@
               <w:rPr>
                 <w:sz w:val="19"/>
               </w:rPr>
-              <w:t>Capture helper entry point (</w:t>
+              <w:t xml:space="preserve">App Launchers commands; installs for the current user directly, for others via the helper; maintains </w:t>
             </w:r>
             <w:r>
               <w:rPr>
@@ -10730,27 +11565,13 @@
                 <w:sz w:val="17"/>
                 <w:shd w:val="clear" w:fill="EEF1F5"/>
               </w:rPr>
-              <w:t>--check</w:t>
-            </w:r>
-            <w:r>
-              <w:rPr>
-                <w:sz w:val="19"/>
-              </w:rPr>
-              <w:t xml:space="preserve">, </w:t>
-            </w:r>
-            <w:r>
-              <w:rPr>
-                <w:rFonts w:ascii="Consolas" w:hAnsi="Consolas"/>
-                <w:sz w:val="17"/>
-                <w:shd w:val="clear" w:fill="EEF1F5"/>
-              </w:rPr>
-              <w:t>capture ...</w:t>
-            </w:r>
-            <w:r>
-              <w:rPr>
-                <w:sz w:val="19"/>
-              </w:rPr>
-              <w:t>)</w:t>
+              <w:t>launchers.json</w:t>
+            </w:r>
+            <w:r>
+              <w:rPr>
+                <w:sz w:val="19"/>
+              </w:rPr>
+              <w:t>; test run with captured output</w:t>
             </w:r>
           </w:p>
         </w:tc>
@@ -10777,7 +11598,7 @@
                 <w:sz w:val="17"/>
                 <w:shd w:val="clear" w:fill="EEF1F5"/>
               </w:rPr>
-              <w:t>bin/syspulse-helper.rs</w:t>
+              <w:t>bin/syspulse-capture.rs</w:t>
             </w:r>
           </w:p>
         </w:tc>
@@ -10799,6 +11620,85 @@
               <w:rPr>
                 <w:sz w:val="19"/>
               </w:rPr>
+              <w:t>Capture helper entry point (</w:t>
+            </w:r>
+            <w:r>
+              <w:rPr>
+                <w:rFonts w:ascii="Consolas" w:hAnsi="Consolas"/>
+                <w:sz w:val="17"/>
+                <w:shd w:val="clear" w:fill="EEF1F5"/>
+              </w:rPr>
+              <w:t>--check</w:t>
+            </w:r>
+            <w:r>
+              <w:rPr>
+                <w:sz w:val="19"/>
+              </w:rPr>
+              <w:t xml:space="preserve">, </w:t>
+            </w:r>
+            <w:r>
+              <w:rPr>
+                <w:rFonts w:ascii="Consolas" w:hAnsi="Consolas"/>
+                <w:sz w:val="17"/>
+                <w:shd w:val="clear" w:fill="EEF1F5"/>
+              </w:rPr>
+              <w:t>capture ...</w:t>
+            </w:r>
+            <w:r>
+              <w:rPr>
+                <w:sz w:val="19"/>
+              </w:rPr>
+              <w:t>)</w:t>
+            </w:r>
+          </w:p>
+        </w:tc>
+      </w:tr>
+      <w:tr>
+        <w:tc>
+          <w:tcPr>
+            <w:tcW w:type="dxa" w:w="2671"/>
+            <w:tcMar>
+              <w:top w:w="60" w:type="dxa"/>
+              <w:bottom w:w="60" w:type="dxa"/>
+              <w:start w:w="100" w:type="dxa"/>
+              <w:end w:w="100" w:type="dxa"/>
+            </w:tcMar>
+            <w:shd w:val="clear" w:color="auto" w:fill="F3F6FB"/>
+          </w:tcPr>
+          <w:p>
+            <w:pPr>
+              <w:spacing w:after="0" w:line="252" w:lineRule="auto"/>
+            </w:pPr>
+            <w:r>
+              <w:rPr>
+                <w:rFonts w:ascii="Consolas" w:hAnsi="Consolas"/>
+                <w:b/>
+                <w:sz w:val="17"/>
+                <w:shd w:val="clear" w:fill="EEF1F5"/>
+              </w:rPr>
+              <w:t>bin/syspulse-helper.rs</w:t>
+            </w:r>
+          </w:p>
+        </w:tc>
+        <w:tc>
+          <w:tcPr>
+            <w:tcW w:type="dxa" w:w="6967"/>
+            <w:tcMar>
+              <w:top w:w="60" w:type="dxa"/>
+              <w:bottom w:w="60" w:type="dxa"/>
+              <w:start w:w="100" w:type="dxa"/>
+              <w:end w:w="100" w:type="dxa"/>
+            </w:tcMar>
+            <w:shd w:val="clear" w:color="auto" w:fill="F3F6FB"/>
+          </w:tcPr>
+          <w:p>
+            <w:pPr>
+              <w:spacing w:after="0" w:line="252" w:lineRule="auto"/>
+            </w:pPr>
+            <w:r>
+              <w:rPr>
+                <w:sz w:val="19"/>
+              </w:rPr>
               <w:t xml:space="preserve">Root helper: requires euid 0, fixed </w:t>
             </w:r>
             <w:r>
@@ -10833,7 +11733,7 @@
       </w:pPr>
     </w:p>
     <w:p>
-      <w:bookmarkStart w:id="15" w:name="sec15"/>
+      <w:bookmarkStart w:id="16" w:name="sec16"/>
       <w:pPr>
         <w:pStyle w:val="Heading1"/>
       </w:pPr>
@@ -10851,7 +11751,7 @@
       <w:r>
         <w:t>)</w:t>
       </w:r>
-      <w:bookmarkEnd w:id="15"/>
+      <w:bookmarkEnd w:id="16"/>
     </w:p>
     <w:tbl>
       <w:tblPr>
@@ -11729,17 +12629,17 @@
       </w:pPr>
     </w:p>
     <w:p>
-      <w:bookmarkStart w:id="16" w:name="sec16"/>
+      <w:bookmarkStart w:id="17" w:name="sec17"/>
       <w:pPr>
         <w:pStyle w:val="Heading1"/>
       </w:pPr>
       <w:r>
         <w:t>8. IPC reference — commands and events</w:t>
       </w:r>
-      <w:bookmarkEnd w:id="16"/>
+      <w:bookmarkEnd w:id="17"/>
     </w:p>
     <w:p>
-      <w:bookmarkStart w:id="17" w:name="sec17"/>
+      <w:bookmarkStart w:id="18" w:name="sec18"/>
       <w:pPr>
         <w:pStyle w:val="Heading2"/>
       </w:pPr>
@@ -11757,7 +12657,7 @@
       <w:r>
         <w:t>)</w:t>
       </w:r>
-      <w:bookmarkEnd w:id="17"/>
+      <w:bookmarkEnd w:id="18"/>
     </w:p>
     <w:tbl>
       <w:tblPr>
@@ -13050,7 +13950,7 @@
                 <w:b/>
                 <w:sz w:val="19"/>
               </w:rPr>
-              <w:t>NetLens (</w:t>
+              <w:t>App Launchers (</w:t>
             </w:r>
             <w:r>
               <w:rPr>
@@ -13059,7 +13959,7 @@
                 <w:sz w:val="17"/>
                 <w:shd w:val="clear" w:fill="EEF1F5"/>
               </w:rPr>
-              <w:t>netlens.rs</w:t>
+              <w:t>launchers.rs</w:t>
             </w:r>
             <w:r>
               <w:rPr>
@@ -13091,7 +13991,7 @@
                 <w:sz w:val="17"/>
                 <w:shd w:val="clear" w:fill="EEF1F5"/>
               </w:rPr>
-              <w:t>netlens_setup</w:t>
+              <w:t>launcher_users</w:t>
             </w:r>
             <w:r>
               <w:rPr>
@@ -13105,7 +14005,7 @@
                 <w:sz w:val="17"/>
                 <w:shd w:val="clear" w:fill="EEF1F5"/>
               </w:rPr>
-              <w:t>netlens_interfaces</w:t>
+              <w:t>launcher_scan</w:t>
             </w:r>
             <w:r>
               <w:rPr>
@@ -13119,7 +14019,7 @@
                 <w:sz w:val="17"/>
                 <w:shd w:val="clear" w:fill="EEF1F5"/>
               </w:rPr>
-              <w:t>netlens_grant</w:t>
+              <w:t>launcher_check</w:t>
             </w:r>
             <w:r>
               <w:rPr>
@@ -13133,7 +14033,7 @@
                 <w:sz w:val="17"/>
                 <w:shd w:val="clear" w:fill="EEF1F5"/>
               </w:rPr>
-              <w:t>netlens_start</w:t>
+              <w:t>launcher_icon_preview</w:t>
             </w:r>
             <w:r>
               <w:rPr>
@@ -13147,7 +14047,7 @@
                 <w:sz w:val="17"/>
                 <w:shd w:val="clear" w:fill="EEF1F5"/>
               </w:rPr>
-              <w:t>netlens_stop</w:t>
+              <w:t>launcher_create</w:t>
             </w:r>
             <w:r>
               <w:rPr>
@@ -13161,7 +14061,7 @@
                 <w:sz w:val="17"/>
                 <w:shd w:val="clear" w:fill="EEF1F5"/>
               </w:rPr>
-              <w:t>netlens_clear</w:t>
+              <w:t>launcher_list</w:t>
             </w:r>
             <w:r>
               <w:rPr>
@@ -13175,7 +14075,7 @@
                 <w:sz w:val="17"/>
                 <w:shd w:val="clear" w:fill="EEF1F5"/>
               </w:rPr>
-              <w:t>netlens_status</w:t>
+              <w:t>launcher_remove</w:t>
             </w:r>
             <w:r>
               <w:rPr>
@@ -13189,231 +14089,7 @@
                 <w:sz w:val="17"/>
                 <w:shd w:val="clear" w:fill="EEF1F5"/>
               </w:rPr>
-              <w:t>netlens_rows</w:t>
-            </w:r>
-            <w:r>
-              <w:rPr>
-                <w:sz w:val="19"/>
-              </w:rPr>
-              <w:t xml:space="preserve">, </w:t>
-            </w:r>
-            <w:r>
-              <w:rPr>
-                <w:rFonts w:ascii="Consolas" w:hAnsi="Consolas"/>
-                <w:sz w:val="17"/>
-                <w:shd w:val="clear" w:fill="EEF1F5"/>
-              </w:rPr>
-              <w:t>netlens_detail</w:t>
-            </w:r>
-            <w:r>
-              <w:rPr>
-                <w:sz w:val="19"/>
-              </w:rPr>
-              <w:t xml:space="preserve">, </w:t>
-            </w:r>
-            <w:r>
-              <w:rPr>
-                <w:rFonts w:ascii="Consolas" w:hAnsi="Consolas"/>
-                <w:sz w:val="17"/>
-                <w:shd w:val="clear" w:fill="EEF1F5"/>
-              </w:rPr>
-              <w:t>netlens_set_filter</w:t>
-            </w:r>
-            <w:r>
-              <w:rPr>
-                <w:sz w:val="19"/>
-              </w:rPr>
-              <w:t xml:space="preserve">, </w:t>
-            </w:r>
-            <w:r>
-              <w:rPr>
-                <w:rFonts w:ascii="Consolas" w:hAnsi="Consolas"/>
-                <w:sz w:val="17"/>
-                <w:shd w:val="clear" w:fill="EEF1F5"/>
-              </w:rPr>
-              <w:t>netlens_check_filter</w:t>
-            </w:r>
-            <w:r>
-              <w:rPr>
-                <w:sz w:val="19"/>
-              </w:rPr>
-              <w:t xml:space="preserve">, </w:t>
-            </w:r>
-            <w:r>
-              <w:rPr>
-                <w:rFonts w:ascii="Consolas" w:hAnsi="Consolas"/>
-                <w:sz w:val="17"/>
-                <w:shd w:val="clear" w:fill="EEF1F5"/>
-              </w:rPr>
-              <w:t>netlens_check_capture_filter</w:t>
-            </w:r>
-            <w:r>
-              <w:rPr>
-                <w:sz w:val="19"/>
-              </w:rPr>
-              <w:t xml:space="preserve">, </w:t>
-            </w:r>
-            <w:r>
-              <w:rPr>
-                <w:rFonts w:ascii="Consolas" w:hAnsi="Consolas"/>
-                <w:sz w:val="17"/>
-                <w:shd w:val="clear" w:fill="EEF1F5"/>
-              </w:rPr>
-              <w:t>netlens_fields</w:t>
-            </w:r>
-            <w:r>
-              <w:rPr>
-                <w:sz w:val="19"/>
-              </w:rPr>
-              <w:t xml:space="preserve">, </w:t>
-            </w:r>
-            <w:r>
-              <w:rPr>
-                <w:rFonts w:ascii="Consolas" w:hAnsi="Consolas"/>
-                <w:sz w:val="17"/>
-                <w:shd w:val="clear" w:fill="EEF1F5"/>
-              </w:rPr>
-              <w:t>netlens_conversations</w:t>
-            </w:r>
-            <w:r>
-              <w:rPr>
-                <w:sz w:val="19"/>
-              </w:rPr>
-              <w:t xml:space="preserve">, </w:t>
-            </w:r>
-            <w:r>
-              <w:rPr>
-                <w:rFonts w:ascii="Consolas" w:hAnsi="Consolas"/>
-                <w:sz w:val="17"/>
-                <w:shd w:val="clear" w:fill="EEF1F5"/>
-              </w:rPr>
-              <w:t>netlens_apps</w:t>
-            </w:r>
-            <w:r>
-              <w:rPr>
-                <w:sz w:val="19"/>
-              </w:rPr>
-              <w:t xml:space="preserve">, </w:t>
-            </w:r>
-            <w:r>
-              <w:rPr>
-                <w:rFonts w:ascii="Consolas" w:hAnsi="Consolas"/>
-                <w:sz w:val="17"/>
-                <w:shd w:val="clear" w:fill="EEF1F5"/>
-              </w:rPr>
-              <w:t>netlens_stats</w:t>
-            </w:r>
-            <w:r>
-              <w:rPr>
-                <w:sz w:val="19"/>
-              </w:rPr>
-              <w:t xml:space="preserve">, </w:t>
-            </w:r>
-            <w:r>
-              <w:rPr>
-                <w:rFonts w:ascii="Consolas" w:hAnsi="Consolas"/>
-                <w:sz w:val="17"/>
-                <w:shd w:val="clear" w:fill="EEF1F5"/>
-              </w:rPr>
-              <w:t>netlens_insights</w:t>
-            </w:r>
-            <w:r>
-              <w:rPr>
-                <w:sz w:val="19"/>
-              </w:rPr>
-              <w:t xml:space="preserve">, </w:t>
-            </w:r>
-            <w:r>
-              <w:rPr>
-                <w:rFonts w:ascii="Consolas" w:hAnsi="Consolas"/>
-                <w:sz w:val="17"/>
-                <w:shd w:val="clear" w:fill="EEF1F5"/>
-              </w:rPr>
-              <w:t>netlens_rtp</w:t>
-            </w:r>
-            <w:r>
-              <w:rPr>
-                <w:sz w:val="19"/>
-              </w:rPr>
-              <w:t xml:space="preserve">, </w:t>
-            </w:r>
-            <w:r>
-              <w:rPr>
-                <w:rFonts w:ascii="Consolas" w:hAnsi="Consolas"/>
-                <w:sz w:val="17"/>
-                <w:shd w:val="clear" w:fill="EEF1F5"/>
-              </w:rPr>
-              <w:t>netlens_follow</w:t>
-            </w:r>
-            <w:r>
-              <w:rPr>
-                <w:sz w:val="19"/>
-              </w:rPr>
-              <w:t xml:space="preserve">, </w:t>
-            </w:r>
-            <w:r>
-              <w:rPr>
-                <w:rFonts w:ascii="Consolas" w:hAnsi="Consolas"/>
-                <w:sz w:val="17"/>
-                <w:shd w:val="clear" w:fill="EEF1F5"/>
-              </w:rPr>
-              <w:t>netlens_locate</w:t>
-            </w:r>
-            <w:r>
-              <w:rPr>
-                <w:sz w:val="19"/>
-              </w:rPr>
-              <w:t xml:space="preserve">, </w:t>
-            </w:r>
-            <w:r>
-              <w:rPr>
-                <w:rFonts w:ascii="Consolas" w:hAnsi="Consolas"/>
-                <w:sz w:val="17"/>
-                <w:shd w:val="clear" w:fill="EEF1F5"/>
-              </w:rPr>
-              <w:t>netlens_open</w:t>
-            </w:r>
-            <w:r>
-              <w:rPr>
-                <w:sz w:val="19"/>
-              </w:rPr>
-              <w:t xml:space="preserve">, </w:t>
-            </w:r>
-            <w:r>
-              <w:rPr>
-                <w:rFonts w:ascii="Consolas" w:hAnsi="Consolas"/>
-                <w:sz w:val="17"/>
-                <w:shd w:val="clear" w:fill="EEF1F5"/>
-              </w:rPr>
-              <w:t>netlens_save</w:t>
-            </w:r>
-            <w:r>
-              <w:rPr>
-                <w:sz w:val="19"/>
-              </w:rPr>
-              <w:t xml:space="preserve">, </w:t>
-            </w:r>
-            <w:r>
-              <w:rPr>
-                <w:rFonts w:ascii="Consolas" w:hAnsi="Consolas"/>
-                <w:sz w:val="17"/>
-                <w:shd w:val="clear" w:fill="EEF1F5"/>
-              </w:rPr>
-              <w:t>netlens_wireshark_decode</w:t>
-            </w:r>
-            <w:r>
-              <w:rPr>
-                <w:sz w:val="19"/>
-              </w:rPr>
-              <w:t xml:space="preserve">, </w:t>
-            </w:r>
-            <w:r>
-              <w:rPr>
-                <w:rFonts w:ascii="Consolas" w:hAnsi="Consolas"/>
-                <w:sz w:val="17"/>
-                <w:shd w:val="clear" w:fill="EEF1F5"/>
-              </w:rPr>
-              <w:t>netlens_open_wireshark</w:t>
+              <w:t>launcher_test_run</w:t>
             </w:r>
           </w:p>
         </w:tc>
@@ -13438,7 +14114,7 @@
                 <w:b/>
                 <w:sz w:val="19"/>
               </w:rPr>
-              <w:t>Recorder (</w:t>
+              <w:t>NetLens (</w:t>
             </w:r>
             <w:r>
               <w:rPr>
@@ -13447,7 +14123,7 @@
                 <w:sz w:val="17"/>
                 <w:shd w:val="clear" w:fill="EEF1F5"/>
               </w:rPr>
-              <w:t>recorder.rs</w:t>
+              <w:t>netlens.rs</w:t>
             </w:r>
             <w:r>
               <w:rPr>
@@ -13478,6 +14154,395 @@
                 <w:sz w:val="17"/>
                 <w:shd w:val="clear" w:fill="EEF1F5"/>
               </w:rPr>
+              <w:t>netlens_setup</w:t>
+            </w:r>
+            <w:r>
+              <w:rPr>
+                <w:sz w:val="19"/>
+              </w:rPr>
+              <w:t xml:space="preserve">, </w:t>
+            </w:r>
+            <w:r>
+              <w:rPr>
+                <w:rFonts w:ascii="Consolas" w:hAnsi="Consolas"/>
+                <w:sz w:val="17"/>
+                <w:shd w:val="clear" w:fill="EEF1F5"/>
+              </w:rPr>
+              <w:t>netlens_interfaces</w:t>
+            </w:r>
+            <w:r>
+              <w:rPr>
+                <w:sz w:val="19"/>
+              </w:rPr>
+              <w:t xml:space="preserve">, </w:t>
+            </w:r>
+            <w:r>
+              <w:rPr>
+                <w:rFonts w:ascii="Consolas" w:hAnsi="Consolas"/>
+                <w:sz w:val="17"/>
+                <w:shd w:val="clear" w:fill="EEF1F5"/>
+              </w:rPr>
+              <w:t>netlens_grant</w:t>
+            </w:r>
+            <w:r>
+              <w:rPr>
+                <w:sz w:val="19"/>
+              </w:rPr>
+              <w:t xml:space="preserve">, </w:t>
+            </w:r>
+            <w:r>
+              <w:rPr>
+                <w:rFonts w:ascii="Consolas" w:hAnsi="Consolas"/>
+                <w:sz w:val="17"/>
+                <w:shd w:val="clear" w:fill="EEF1F5"/>
+              </w:rPr>
+              <w:t>netlens_start</w:t>
+            </w:r>
+            <w:r>
+              <w:rPr>
+                <w:sz w:val="19"/>
+              </w:rPr>
+              <w:t xml:space="preserve">, </w:t>
+            </w:r>
+            <w:r>
+              <w:rPr>
+                <w:rFonts w:ascii="Consolas" w:hAnsi="Consolas"/>
+                <w:sz w:val="17"/>
+                <w:shd w:val="clear" w:fill="EEF1F5"/>
+              </w:rPr>
+              <w:t>netlens_stop</w:t>
+            </w:r>
+            <w:r>
+              <w:rPr>
+                <w:sz w:val="19"/>
+              </w:rPr>
+              <w:t xml:space="preserve">, </w:t>
+            </w:r>
+            <w:r>
+              <w:rPr>
+                <w:rFonts w:ascii="Consolas" w:hAnsi="Consolas"/>
+                <w:sz w:val="17"/>
+                <w:shd w:val="clear" w:fill="EEF1F5"/>
+              </w:rPr>
+              <w:t>netlens_clear</w:t>
+            </w:r>
+            <w:r>
+              <w:rPr>
+                <w:sz w:val="19"/>
+              </w:rPr>
+              <w:t xml:space="preserve">, </w:t>
+            </w:r>
+            <w:r>
+              <w:rPr>
+                <w:rFonts w:ascii="Consolas" w:hAnsi="Consolas"/>
+                <w:sz w:val="17"/>
+                <w:shd w:val="clear" w:fill="EEF1F5"/>
+              </w:rPr>
+              <w:t>netlens_status</w:t>
+            </w:r>
+            <w:r>
+              <w:rPr>
+                <w:sz w:val="19"/>
+              </w:rPr>
+              <w:t xml:space="preserve">, </w:t>
+            </w:r>
+            <w:r>
+              <w:rPr>
+                <w:rFonts w:ascii="Consolas" w:hAnsi="Consolas"/>
+                <w:sz w:val="17"/>
+                <w:shd w:val="clear" w:fill="EEF1F5"/>
+              </w:rPr>
+              <w:t>netlens_rows</w:t>
+            </w:r>
+            <w:r>
+              <w:rPr>
+                <w:sz w:val="19"/>
+              </w:rPr>
+              <w:t xml:space="preserve">, </w:t>
+            </w:r>
+            <w:r>
+              <w:rPr>
+                <w:rFonts w:ascii="Consolas" w:hAnsi="Consolas"/>
+                <w:sz w:val="17"/>
+                <w:shd w:val="clear" w:fill="EEF1F5"/>
+              </w:rPr>
+              <w:t>netlens_detail</w:t>
+            </w:r>
+            <w:r>
+              <w:rPr>
+                <w:sz w:val="19"/>
+              </w:rPr>
+              <w:t xml:space="preserve">, </w:t>
+            </w:r>
+            <w:r>
+              <w:rPr>
+                <w:rFonts w:ascii="Consolas" w:hAnsi="Consolas"/>
+                <w:sz w:val="17"/>
+                <w:shd w:val="clear" w:fill="EEF1F5"/>
+              </w:rPr>
+              <w:t>netlens_set_filter</w:t>
+            </w:r>
+            <w:r>
+              <w:rPr>
+                <w:sz w:val="19"/>
+              </w:rPr>
+              <w:t xml:space="preserve">, </w:t>
+            </w:r>
+            <w:r>
+              <w:rPr>
+                <w:rFonts w:ascii="Consolas" w:hAnsi="Consolas"/>
+                <w:sz w:val="17"/>
+                <w:shd w:val="clear" w:fill="EEF1F5"/>
+              </w:rPr>
+              <w:t>netlens_check_filter</w:t>
+            </w:r>
+            <w:r>
+              <w:rPr>
+                <w:sz w:val="19"/>
+              </w:rPr>
+              <w:t xml:space="preserve">, </w:t>
+            </w:r>
+            <w:r>
+              <w:rPr>
+                <w:rFonts w:ascii="Consolas" w:hAnsi="Consolas"/>
+                <w:sz w:val="17"/>
+                <w:shd w:val="clear" w:fill="EEF1F5"/>
+              </w:rPr>
+              <w:t>netlens_check_capture_filter</w:t>
+            </w:r>
+            <w:r>
+              <w:rPr>
+                <w:sz w:val="19"/>
+              </w:rPr>
+              <w:t xml:space="preserve">, </w:t>
+            </w:r>
+            <w:r>
+              <w:rPr>
+                <w:rFonts w:ascii="Consolas" w:hAnsi="Consolas"/>
+                <w:sz w:val="17"/>
+                <w:shd w:val="clear" w:fill="EEF1F5"/>
+              </w:rPr>
+              <w:t>netlens_fields</w:t>
+            </w:r>
+            <w:r>
+              <w:rPr>
+                <w:sz w:val="19"/>
+              </w:rPr>
+              <w:t xml:space="preserve">, </w:t>
+            </w:r>
+            <w:r>
+              <w:rPr>
+                <w:rFonts w:ascii="Consolas" w:hAnsi="Consolas"/>
+                <w:sz w:val="17"/>
+                <w:shd w:val="clear" w:fill="EEF1F5"/>
+              </w:rPr>
+              <w:t>netlens_conversations</w:t>
+            </w:r>
+            <w:r>
+              <w:rPr>
+                <w:sz w:val="19"/>
+              </w:rPr>
+              <w:t xml:space="preserve">, </w:t>
+            </w:r>
+            <w:r>
+              <w:rPr>
+                <w:rFonts w:ascii="Consolas" w:hAnsi="Consolas"/>
+                <w:sz w:val="17"/>
+                <w:shd w:val="clear" w:fill="EEF1F5"/>
+              </w:rPr>
+              <w:t>netlens_apps</w:t>
+            </w:r>
+            <w:r>
+              <w:rPr>
+                <w:sz w:val="19"/>
+              </w:rPr>
+              <w:t xml:space="preserve">, </w:t>
+            </w:r>
+            <w:r>
+              <w:rPr>
+                <w:rFonts w:ascii="Consolas" w:hAnsi="Consolas"/>
+                <w:sz w:val="17"/>
+                <w:shd w:val="clear" w:fill="EEF1F5"/>
+              </w:rPr>
+              <w:t>netlens_stats</w:t>
+            </w:r>
+            <w:r>
+              <w:rPr>
+                <w:sz w:val="19"/>
+              </w:rPr>
+              <w:t xml:space="preserve">, </w:t>
+            </w:r>
+            <w:r>
+              <w:rPr>
+                <w:rFonts w:ascii="Consolas" w:hAnsi="Consolas"/>
+                <w:sz w:val="17"/>
+                <w:shd w:val="clear" w:fill="EEF1F5"/>
+              </w:rPr>
+              <w:t>netlens_insights</w:t>
+            </w:r>
+            <w:r>
+              <w:rPr>
+                <w:sz w:val="19"/>
+              </w:rPr>
+              <w:t xml:space="preserve">, </w:t>
+            </w:r>
+            <w:r>
+              <w:rPr>
+                <w:rFonts w:ascii="Consolas" w:hAnsi="Consolas"/>
+                <w:sz w:val="17"/>
+                <w:shd w:val="clear" w:fill="EEF1F5"/>
+              </w:rPr>
+              <w:t>netlens_rtp</w:t>
+            </w:r>
+            <w:r>
+              <w:rPr>
+                <w:sz w:val="19"/>
+              </w:rPr>
+              <w:t xml:space="preserve">, </w:t>
+            </w:r>
+            <w:r>
+              <w:rPr>
+                <w:rFonts w:ascii="Consolas" w:hAnsi="Consolas"/>
+                <w:sz w:val="17"/>
+                <w:shd w:val="clear" w:fill="EEF1F5"/>
+              </w:rPr>
+              <w:t>netlens_follow</w:t>
+            </w:r>
+            <w:r>
+              <w:rPr>
+                <w:sz w:val="19"/>
+              </w:rPr>
+              <w:t xml:space="preserve">, </w:t>
+            </w:r>
+            <w:r>
+              <w:rPr>
+                <w:rFonts w:ascii="Consolas" w:hAnsi="Consolas"/>
+                <w:sz w:val="17"/>
+                <w:shd w:val="clear" w:fill="EEF1F5"/>
+              </w:rPr>
+              <w:t>netlens_locate</w:t>
+            </w:r>
+            <w:r>
+              <w:rPr>
+                <w:sz w:val="19"/>
+              </w:rPr>
+              <w:t xml:space="preserve">, </w:t>
+            </w:r>
+            <w:r>
+              <w:rPr>
+                <w:rFonts w:ascii="Consolas" w:hAnsi="Consolas"/>
+                <w:sz w:val="17"/>
+                <w:shd w:val="clear" w:fill="EEF1F5"/>
+              </w:rPr>
+              <w:t>netlens_open</w:t>
+            </w:r>
+            <w:r>
+              <w:rPr>
+                <w:sz w:val="19"/>
+              </w:rPr>
+              <w:t xml:space="preserve">, </w:t>
+            </w:r>
+            <w:r>
+              <w:rPr>
+                <w:rFonts w:ascii="Consolas" w:hAnsi="Consolas"/>
+                <w:sz w:val="17"/>
+                <w:shd w:val="clear" w:fill="EEF1F5"/>
+              </w:rPr>
+              <w:t>netlens_save</w:t>
+            </w:r>
+            <w:r>
+              <w:rPr>
+                <w:sz w:val="19"/>
+              </w:rPr>
+              <w:t xml:space="preserve">, </w:t>
+            </w:r>
+            <w:r>
+              <w:rPr>
+                <w:rFonts w:ascii="Consolas" w:hAnsi="Consolas"/>
+                <w:sz w:val="17"/>
+                <w:shd w:val="clear" w:fill="EEF1F5"/>
+              </w:rPr>
+              <w:t>netlens_wireshark_decode</w:t>
+            </w:r>
+            <w:r>
+              <w:rPr>
+                <w:sz w:val="19"/>
+              </w:rPr>
+              <w:t xml:space="preserve">, </w:t>
+            </w:r>
+            <w:r>
+              <w:rPr>
+                <w:rFonts w:ascii="Consolas" w:hAnsi="Consolas"/>
+                <w:sz w:val="17"/>
+                <w:shd w:val="clear" w:fill="EEF1F5"/>
+              </w:rPr>
+              <w:t>netlens_open_wireshark</w:t>
+            </w:r>
+          </w:p>
+        </w:tc>
+      </w:tr>
+      <w:tr>
+        <w:tc>
+          <w:tcPr>
+            <w:tcW w:type="dxa" w:w="3067"/>
+            <w:tcMar>
+              <w:top w:w="60" w:type="dxa"/>
+              <w:bottom w:w="60" w:type="dxa"/>
+              <w:start w:w="100" w:type="dxa"/>
+              <w:end w:w="100" w:type="dxa"/>
+            </w:tcMar>
+            <w:shd w:val="clear" w:color="auto" w:fill="F3F6FB"/>
+          </w:tcPr>
+          <w:p>
+            <w:pPr>
+              <w:spacing w:after="0" w:line="252" w:lineRule="auto"/>
+            </w:pPr>
+            <w:r>
+              <w:rPr>
+                <w:b/>
+                <w:sz w:val="19"/>
+              </w:rPr>
+              <w:t>Recorder (</w:t>
+            </w:r>
+            <w:r>
+              <w:rPr>
+                <w:rFonts w:ascii="Consolas" w:hAnsi="Consolas"/>
+                <w:b/>
+                <w:sz w:val="17"/>
+                <w:shd w:val="clear" w:fill="EEF1F5"/>
+              </w:rPr>
+              <w:t>recorder.rs</w:t>
+            </w:r>
+            <w:r>
+              <w:rPr>
+                <w:b/>
+                <w:sz w:val="19"/>
+              </w:rPr>
+              <w:t>)</w:t>
+            </w:r>
+          </w:p>
+        </w:tc>
+        <w:tc>
+          <w:tcPr>
+            <w:tcW w:type="dxa" w:w="6571"/>
+            <w:tcMar>
+              <w:top w:w="60" w:type="dxa"/>
+              <w:bottom w:w="60" w:type="dxa"/>
+              <w:start w:w="100" w:type="dxa"/>
+              <w:end w:w="100" w:type="dxa"/>
+            </w:tcMar>
+            <w:shd w:val="clear" w:color="auto" w:fill="F3F6FB"/>
+          </w:tcPr>
+          <w:p>
+            <w:pPr>
+              <w:spacing w:after="0" w:line="252" w:lineRule="auto"/>
+            </w:pPr>
+            <w:r>
+              <w:rPr>
+                <w:rFonts w:ascii="Consolas" w:hAnsi="Consolas"/>
+                <w:sz w:val="17"/>
+                <w:shd w:val="clear" w:fill="EEF1F5"/>
+              </w:rPr>
               <w:t>rec_sources</w:t>
             </w:r>
             <w:r>
@@ -13658,7 +14723,7 @@
       </w:pPr>
     </w:p>
     <w:p>
-      <w:bookmarkStart w:id="18" w:name="sec18"/>
+      <w:bookmarkStart w:id="19" w:name="sec19"/>
       <w:pPr>
         <w:pStyle w:val="Heading2"/>
       </w:pPr>
@@ -13676,7 +14741,7 @@
       <w:r>
         <w:t>)</w:t>
       </w:r>
-      <w:bookmarkEnd w:id="18"/>
+      <w:bookmarkEnd w:id="19"/>
     </w:p>
     <w:tbl>
       <w:tblPr>
@@ -14626,7 +15691,7 @@
       <w:r>
         <w:t xml:space="preserve">NetLens sends no events: its UI pulls status and visible rows (see </w:t>
       </w:r>
-      <w:hyperlink w:anchor="sec19">
+      <w:hyperlink w:anchor="sec20">
         <w:r>
           <w:rPr>
             <w:color w:val="1F6FEB"/>
@@ -14694,14 +15759,14 @@
       </w:r>
     </w:p>
     <w:p>
-      <w:bookmarkStart w:id="19" w:name="sec19"/>
+      <w:bookmarkStart w:id="20" w:name="sec20"/>
       <w:pPr>
         <w:pStyle w:val="Heading1"/>
       </w:pPr>
       <w:r>
         <w:t>9. Data flows</w:t>
       </w:r>
-      <w:bookmarkEnd w:id="19"/>
+      <w:bookmarkEnd w:id="20"/>
     </w:p>
     <w:p>
       <w:r>
@@ -15065,14 +16130,14 @@
       </w:r>
     </w:p>
     <w:p>
-      <w:bookmarkStart w:id="20" w:name="sec20"/>
+      <w:bookmarkStart w:id="21" w:name="sec21"/>
       <w:pPr>
         <w:pStyle w:val="Heading1"/>
       </w:pPr>
       <w:r>
         <w:t>10. Security model</w:t>
       </w:r>
-      <w:bookmarkEnd w:id="20"/>
+      <w:bookmarkEnd w:id="21"/>
     </w:p>
     <w:p>
       <w:pPr>
@@ -15449,39 +16514,18 @@
     </w:p>
     <w:p>
       <w:pPr>
-        <w:tabs>
-          <w:tab w:pos="357" w:val="left"/>
-        </w:tabs>
-        <w:spacing w:after="60"/>
-        <w:ind w:left="357" w:hanging="357"/>
+        <w:pStyle w:val="ListBullet2"/>
       </w:pPr>
-      <w:r>
-        <w:rPr>
-          <w:b/>
-          <w:color w:val="1F6FEB"/>
-        </w:rPr>
-        <w:t>3.</w:t>
-        <w:tab/>
-      </w:r>
-      <w:r>
-        <w:rPr>
-          <w:b/>
-        </w:rPr>
-        <w:t>Polkit:</w:t>
-      </w:r>
-      <w:r>
-        <w:t xml:space="preserve"> action </w:t>
-      </w:r>
       <w:r>
         <w:rPr>
           <w:rFonts w:ascii="Consolas" w:hAnsi="Consolas"/>
           <w:sz w:val="19"/>
           <w:shd w:val="clear" w:fill="EEF1F5"/>
         </w:rPr>
-        <w:t>io.github.praneeth.syspulse.helper</w:t>
-      </w:r>
-      <w:r>
-        <w:t xml:space="preserve"> with </w:t>
+        <w:t>installLauncher</w:t>
+      </w:r>
+      <w:r>
+        <w:t xml:space="preserve"> / </w:t>
       </w:r>
       <w:r>
         <w:rPr>
@@ -15489,10 +16533,21 @@
           <w:sz w:val="19"/>
           <w:shd w:val="clear" w:fill="EEF1F5"/>
         </w:rPr>
-        <w:t>auth_admin_keep</w:t>
-      </w:r>
-      <w:r>
-        <w:t xml:space="preserve"> for active sessions (one password covers a few minutes).</w:t>
+        <w:t>removeLauncher</w:t>
+      </w:r>
+      <w:r>
+        <w:t xml:space="preserve">: target accounts must be real login users (not root); the spec is re-validated (id charset, no control characters, absolute normalised paths, program canonically inside the folder, system folders refused, interpreter allow-list); the icon arrives as validated bytes (PNG/SVG/XPM signature, ≤ 2 MB) — the helper never opens the icon source. Files in homes are written as the user via </w:t>
+      </w:r>
+      <w:r>
+        <w:rPr>
+          <w:rFonts w:ascii="Consolas" w:hAnsi="Consolas"/>
+          <w:sz w:val="19"/>
+          <w:shd w:val="clear" w:fill="EEF1F5"/>
+        </w:rPr>
+        <w:t>runuser</w:t>
+      </w:r>
+      <w:r>
+        <w:t>; nothing from the application folder is executed as root; ACL removal is limited to the folder and its recorded ancestors.</w:t>
       </w:r>
     </w:p>
     <w:p>
@@ -15508,46 +16563,17 @@
           <w:b/>
           <w:color w:val="1F6FEB"/>
         </w:rPr>
-        <w:t>4.</w:t>
+        <w:t>3.</w:t>
         <w:tab/>
       </w:r>
       <w:r>
         <w:rPr>
           <w:b/>
         </w:rPr>
-        <w:t>Input validation everywhere:</w:t>
-      </w:r>
-    </w:p>
-    <w:p>
-      <w:pPr>
-        <w:pStyle w:val="ListBullet2"/>
-      </w:pPr>
-      <w:r>
-        <w:t>Host names for ping and trace.</w:t>
-      </w:r>
-    </w:p>
-    <w:p>
-      <w:pPr>
-        <w:pStyle w:val="ListBullet2"/>
-      </w:pPr>
-      <w:r>
-        <w:t>IP / CIDR / DNS / MTU and method whitelists for NetworkManager.</w:t>
-      </w:r>
-    </w:p>
-    <w:p>
-      <w:pPr>
-        <w:pStyle w:val="ListBullet2"/>
-      </w:pPr>
-      <w:r>
-        <w:t>Unit names and autostart IDs.</w:t>
-      </w:r>
-    </w:p>
-    <w:p>
-      <w:pPr>
-        <w:pStyle w:val="ListBullet2"/>
-      </w:pPr>
-      <w:r>
-        <w:t>Recorder device names and window IDs (</w:t>
+        <w:t>Polkit:</w:t>
+      </w:r>
+      <w:r>
+        <w:t xml:space="preserve"> action </w:t>
       </w:r>
       <w:r>
         <w:rPr>
@@ -15555,18 +16581,21 @@
           <w:sz w:val="19"/>
           <w:shd w:val="clear" w:fill="EEF1F5"/>
         </w:rPr>
-        <w:t>[A-Za-z0-9._:@-]</w:t>
-      </w:r>
-      <w:r>
-        <w:t>), and gst-launch values quoted.</w:t>
-      </w:r>
-    </w:p>
-    <w:p>
-      <w:pPr>
-        <w:pStyle w:val="ListBullet2"/>
-      </w:pPr>
-      <w:r>
-        <w:t>PacketForge payload size (≤ 1 MiB) and UDP datagram size.</w:t>
+        <w:t>io.github.praneeth.syspulse.helper</w:t>
+      </w:r>
+      <w:r>
+        <w:t xml:space="preserve"> with </w:t>
+      </w:r>
+      <w:r>
+        <w:rPr>
+          <w:rFonts w:ascii="Consolas" w:hAnsi="Consolas"/>
+          <w:sz w:val="19"/>
+          <w:shd w:val="clear" w:fill="EEF1F5"/>
+        </w:rPr>
+        <w:t>auth_admin_keep</w:t>
+      </w:r>
+      <w:r>
+        <w:t xml:space="preserve"> for active sessions (one password covers a few minutes).</w:t>
       </w:r>
     </w:p>
     <w:p>
@@ -15582,14 +16611,14 @@
           <w:b/>
           <w:color w:val="1F6FEB"/>
         </w:rPr>
-        <w:t>5.</w:t>
+        <w:t>4.</w:t>
         <w:tab/>
       </w:r>
       <w:r>
         <w:rPr>
           <w:b/>
         </w:rPr>
-        <w:t>Packet capture is isolated:</w:t>
+        <w:t>Input validation everywhere:</w:t>
       </w:r>
     </w:p>
     <w:p>
@@ -15597,7 +16626,31 @@
         <w:pStyle w:val="ListBullet2"/>
       </w:pPr>
       <w:r>
-        <w:t xml:space="preserve">Only </w:t>
+        <w:t>Host names for ping and trace.</w:t>
+      </w:r>
+    </w:p>
+    <w:p>
+      <w:pPr>
+        <w:pStyle w:val="ListBullet2"/>
+      </w:pPr>
+      <w:r>
+        <w:t>IP / CIDR / DNS / MTU and method whitelists for NetworkManager.</w:t>
+      </w:r>
+    </w:p>
+    <w:p>
+      <w:pPr>
+        <w:pStyle w:val="ListBullet2"/>
+      </w:pPr>
+      <w:r>
+        <w:t>Unit names and autostart IDs.</w:t>
+      </w:r>
+    </w:p>
+    <w:p>
+      <w:pPr>
+        <w:pStyle w:val="ListBullet2"/>
+      </w:pPr>
+      <w:r>
+        <w:t>Recorder device names and window IDs (</w:t>
       </w:r>
       <w:r>
         <w:rPr>
@@ -15605,21 +16658,10 @@
           <w:sz w:val="19"/>
           <w:shd w:val="clear" w:fill="EEF1F5"/>
         </w:rPr>
-        <w:t>syspulse-capture</w:t>
-      </w:r>
-      <w:r>
-        <w:t xml:space="preserve"> holds </w:t>
-      </w:r>
-      <w:r>
-        <w:rPr>
-          <w:rFonts w:ascii="Consolas" w:hAnsi="Consolas"/>
-          <w:sz w:val="19"/>
-          <w:shd w:val="clear" w:fill="EEF1F5"/>
-        </w:rPr>
-        <w:t>cap_net_raw,cap_net_admin</w:t>
-      </w:r>
-      <w:r>
-        <w:t xml:space="preserve"> (never root, never the GUI — GTK refuses to run with elevated rights anyway).</w:t>
+        <w:t>[A-Za-z0-9._:@-]</w:t>
+      </w:r>
+      <w:r>
+        <w:t>), and gst-launch values quoted.</w:t>
       </w:r>
     </w:p>
     <w:p>
@@ -15627,43 +16669,7 @@
         <w:pStyle w:val="ListBullet2"/>
       </w:pPr>
       <w:r>
-        <w:t xml:space="preserve">It accepts only interface names (validated) and pre-compiled BPF bytecode, opens its sockets, then drops </w:t>
-      </w:r>
-      <w:r>
-        <w:rPr>
-          <w:b/>
-        </w:rPr>
-        <w:t>all</w:t>
-      </w:r>
-      <w:r>
-        <w:t xml:space="preserve"> capabilities and sets </w:t>
-      </w:r>
-      <w:r>
-        <w:rPr>
-          <w:rFonts w:ascii="Consolas" w:hAnsi="Consolas"/>
-          <w:sz w:val="19"/>
-          <w:shd w:val="clear" w:fill="EEF1F5"/>
-        </w:rPr>
-        <w:t>no_new_privs</w:t>
-      </w:r>
-      <w:r>
-        <w:t xml:space="preserve"> before reading a single packet.</w:t>
-      </w:r>
-    </w:p>
-    <w:p>
-      <w:pPr>
-        <w:pStyle w:val="ListBullet2"/>
-      </w:pPr>
-      <w:r>
-        <w:t>Any modification of the binary clears its capabilities (kernel rule), so a replaced helper is never privileged.</w:t>
-      </w:r>
-    </w:p>
-    <w:p>
-      <w:pPr>
-        <w:pStyle w:val="ListBullet2"/>
-      </w:pPr>
-      <w:r>
-        <w:t>Dissectors use bounds-checked reads only and are fuzz-tested with random frames on every link type.</w:t>
+        <w:t>PacketForge payload size (≤ 1 MiB) and UDP datagram size.</w:t>
       </w:r>
     </w:p>
     <w:p>
@@ -15679,14 +16685,14 @@
           <w:b/>
           <w:color w:val="1F6FEB"/>
         </w:rPr>
-        <w:t>6.</w:t>
+        <w:t>5.</w:t>
         <w:tab/>
       </w:r>
       <w:r>
         <w:rPr>
           <w:b/>
         </w:rPr>
-        <w:t>Network listeners are opt-in:</w:t>
+        <w:t>Packet capture is isolated:</w:t>
       </w:r>
     </w:p>
     <w:p>
@@ -15694,7 +16700,29 @@
         <w:pStyle w:val="ListBullet2"/>
       </w:pPr>
       <w:r>
-        <w:t>The speed-test server runs only while Server mode is on. It runs one test at a time, accepts data only from the session's peer, and can require a 6-digit access code.</w:t>
+        <w:t xml:space="preserve">Only </w:t>
+      </w:r>
+      <w:r>
+        <w:rPr>
+          <w:rFonts w:ascii="Consolas" w:hAnsi="Consolas"/>
+          <w:sz w:val="19"/>
+          <w:shd w:val="clear" w:fill="EEF1F5"/>
+        </w:rPr>
+        <w:t>syspulse-capture</w:t>
+      </w:r>
+      <w:r>
+        <w:t xml:space="preserve"> holds </w:t>
+      </w:r>
+      <w:r>
+        <w:rPr>
+          <w:rFonts w:ascii="Consolas" w:hAnsi="Consolas"/>
+          <w:sz w:val="19"/>
+          <w:shd w:val="clear" w:fill="EEF1F5"/>
+        </w:rPr>
+        <w:t>cap_net_raw,cap_net_admin</w:t>
+      </w:r>
+      <w:r>
+        <w:t xml:space="preserve"> (never root, never the GUI — GTK refuses to run with elevated rights anyway).</w:t>
       </w:r>
     </w:p>
     <w:p>
@@ -15702,7 +16730,43 @@
         <w:pStyle w:val="ListBullet2"/>
       </w:pPr>
       <w:r>
-        <w:t>The PacketForge TCP server binds to the address you choose (127.0.0.1 is offered).</w:t>
+        <w:t xml:space="preserve">It accepts only interface names (validated) and pre-compiled BPF bytecode, opens its sockets, then drops </w:t>
+      </w:r>
+      <w:r>
+        <w:rPr>
+          <w:b/>
+        </w:rPr>
+        <w:t>all</w:t>
+      </w:r>
+      <w:r>
+        <w:t xml:space="preserve"> capabilities and sets </w:t>
+      </w:r>
+      <w:r>
+        <w:rPr>
+          <w:rFonts w:ascii="Consolas" w:hAnsi="Consolas"/>
+          <w:sz w:val="19"/>
+          <w:shd w:val="clear" w:fill="EEF1F5"/>
+        </w:rPr>
+        <w:t>no_new_privs</w:t>
+      </w:r>
+      <w:r>
+        <w:t xml:space="preserve"> before reading a single packet.</w:t>
+      </w:r>
+    </w:p>
+    <w:p>
+      <w:pPr>
+        <w:pStyle w:val="ListBullet2"/>
+      </w:pPr>
+      <w:r>
+        <w:t>Any modification of the binary clears its capabilities (kernel rule), so a replaced helper is never privileged.</w:t>
+      </w:r>
+    </w:p>
+    <w:p>
+      <w:pPr>
+        <w:pStyle w:val="ListBullet2"/>
+      </w:pPr>
+      <w:r>
+        <w:t>Dissectors use bounds-checked reads only and are fuzz-tested with random frames on every link type.</w:t>
       </w:r>
     </w:p>
     <w:p>
@@ -15718,39 +16782,30 @@
           <w:b/>
           <w:color w:val="1F6FEB"/>
         </w:rPr>
-        <w:t>7.</w:t>
+        <w:t>6.</w:t>
         <w:tab/>
       </w:r>
       <w:r>
         <w:rPr>
           <w:b/>
         </w:rPr>
-        <w:t>Webview hardening:</w:t>
-      </w:r>
-      <w:r>
-        <w:t xml:space="preserve"> strict CSP (</w:t>
-      </w:r>
-      <w:r>
-        <w:rPr>
-          <w:rFonts w:ascii="Consolas" w:hAnsi="Consolas"/>
-          <w:sz w:val="19"/>
-          <w:shd w:val="clear" w:fill="EEF1F5"/>
-        </w:rPr>
-        <w:t>default-src 'self'</w:t>
-      </w:r>
-      <w:r>
-        <w:t xml:space="preserve">). Capabilities grant only </w:t>
-      </w:r>
-      <w:r>
-        <w:rPr>
-          <w:rFonts w:ascii="Consolas" w:hAnsi="Consolas"/>
-          <w:sz w:val="19"/>
-          <w:shd w:val="clear" w:fill="EEF1F5"/>
-        </w:rPr>
-        <w:t>core:default</w:t>
-      </w:r>
-      <w:r>
-        <w:t xml:space="preserve"> and the dialog permissions; the region-picker window has its own minimal capability.</w:t>
+        <w:t>Network listeners are opt-in:</w:t>
+      </w:r>
+    </w:p>
+    <w:p>
+      <w:pPr>
+        <w:pStyle w:val="ListBullet2"/>
+      </w:pPr>
+      <w:r>
+        <w:t>The speed-test server runs only while Server mode is on. It runs one test at a time, accepts data only from the session's peer, and can require a 6-digit access code.</w:t>
+      </w:r>
+    </w:p>
+    <w:p>
+      <w:pPr>
+        <w:pStyle w:val="ListBullet2"/>
+      </w:pPr>
+      <w:r>
+        <w:t>The PacketForge TCP server binds to the address you choose (127.0.0.1 is offered).</w:t>
       </w:r>
     </w:p>
     <w:p>
@@ -15766,6 +16821,54 @@
           <w:b/>
           <w:color w:val="1F6FEB"/>
         </w:rPr>
+        <w:t>7.</w:t>
+        <w:tab/>
+      </w:r>
+      <w:r>
+        <w:rPr>
+          <w:b/>
+        </w:rPr>
+        <w:t>Webview hardening:</w:t>
+      </w:r>
+      <w:r>
+        <w:t xml:space="preserve"> strict CSP (</w:t>
+      </w:r>
+      <w:r>
+        <w:rPr>
+          <w:rFonts w:ascii="Consolas" w:hAnsi="Consolas"/>
+          <w:sz w:val="19"/>
+          <w:shd w:val="clear" w:fill="EEF1F5"/>
+        </w:rPr>
+        <w:t>default-src 'self'</w:t>
+      </w:r>
+      <w:r>
+        <w:t xml:space="preserve">). Capabilities grant only </w:t>
+      </w:r>
+      <w:r>
+        <w:rPr>
+          <w:rFonts w:ascii="Consolas" w:hAnsi="Consolas"/>
+          <w:sz w:val="19"/>
+          <w:shd w:val="clear" w:fill="EEF1F5"/>
+        </w:rPr>
+        <w:t>core:default</w:t>
+      </w:r>
+      <w:r>
+        <w:t xml:space="preserve"> and the dialog permissions; the region-picker window has its own minimal capability.</w:t>
+      </w:r>
+    </w:p>
+    <w:p>
+      <w:pPr>
+        <w:tabs>
+          <w:tab w:pos="357" w:val="left"/>
+        </w:tabs>
+        <w:spacing w:after="60"/>
+        <w:ind w:left="357" w:hanging="357"/>
+      </w:pPr>
+      <w:r>
+        <w:rPr>
+          <w:b/>
+          <w:color w:val="1F6FEB"/>
+        </w:rPr>
         <w:t>8.</w:t>
         <w:tab/>
       </w:r>
@@ -15791,17 +16894,17 @@
       </w:r>
     </w:p>
     <w:p>
-      <w:bookmarkStart w:id="21" w:name="sec21"/>
+      <w:bookmarkStart w:id="22" w:name="sec22"/>
       <w:pPr>
         <w:pStyle w:val="Heading1"/>
       </w:pPr>
       <w:r>
         <w:t>11. Protocols and formats</w:t>
       </w:r>
-      <w:bookmarkEnd w:id="21"/>
+      <w:bookmarkEnd w:id="22"/>
     </w:p>
     <w:p>
-      <w:bookmarkStart w:id="22" w:name="sec22"/>
+      <w:bookmarkStart w:id="23" w:name="sec23"/>
       <w:pPr>
         <w:pStyle w:val="Heading2"/>
       </w:pPr>
@@ -15819,7 +16922,7 @@
       <w:r>
         <w:t>)</w:t>
       </w:r>
-      <w:bookmarkEnd w:id="22"/>
+      <w:bookmarkEnd w:id="23"/>
     </w:p>
     <w:p>
       <w:pPr>
@@ -16106,14 +17209,14 @@
       </w:r>
     </w:p>
     <w:p>
-      <w:bookmarkStart w:id="23" w:name="sec23"/>
+      <w:bookmarkStart w:id="24" w:name="sec24"/>
       <w:pPr>
         <w:pStyle w:val="Heading2"/>
       </w:pPr>
       <w:r>
         <w:t>11.2 PacketForge notation</w:t>
       </w:r>
-      <w:bookmarkEnd w:id="23"/>
+      <w:bookmarkEnd w:id="24"/>
     </w:p>
     <w:tbl>
       <w:tblPr>
@@ -16730,14 +17833,14 @@
       </w:pPr>
     </w:p>
     <w:p>
-      <w:bookmarkStart w:id="24" w:name="sec24"/>
+      <w:bookmarkStart w:id="25" w:name="sec25"/>
       <w:pPr>
         <w:pStyle w:val="Heading2"/>
       </w:pPr>
       <w:r>
         <w:t>11.3 NetLens capture stream and filters</w:t>
       </w:r>
-      <w:bookmarkEnd w:id="24"/>
+      <w:bookmarkEnd w:id="25"/>
     </w:p>
     <w:p>
       <w:pPr>
@@ -16981,14 +18084,14 @@
       </w:r>
     </w:p>
     <w:p>
-      <w:bookmarkStart w:id="25" w:name="sec25"/>
+      <w:bookmarkStart w:id="26" w:name="sec26"/>
       <w:pPr>
         <w:pStyle w:val="Heading1"/>
       </w:pPr>
       <w:r>
         <w:t>12. Performance engineering</w:t>
       </w:r>
-      <w:bookmarkEnd w:id="25"/>
+      <w:bookmarkEnd w:id="26"/>
     </w:p>
     <w:tbl>
       <w:tblPr>
@@ -17580,14 +18683,14 @@
       </w:pPr>
     </w:p>
     <w:p>
-      <w:bookmarkStart w:id="26" w:name="sec26"/>
+      <w:bookmarkStart w:id="27" w:name="sec27"/>
       <w:pPr>
         <w:pStyle w:val="Heading1"/>
       </w:pPr>
       <w:r>
         <w:t>13. Persistence and configuration</w:t>
       </w:r>
-      <w:bookmarkEnd w:id="26"/>
+      <w:bookmarkEnd w:id="27"/>
     </w:p>
     <w:tbl>
       <w:tblPr>
@@ -18237,14 +19340,14 @@
       </w:pPr>
     </w:p>
     <w:p>
-      <w:bookmarkStart w:id="27" w:name="sec27"/>
+      <w:bookmarkStart w:id="28" w:name="sec28"/>
       <w:pPr>
         <w:pStyle w:val="Heading1"/>
       </w:pPr>
       <w:r>
         <w:t>14. Testing strategy</w:t>
       </w:r>
-      <w:bookmarkEnd w:id="27"/>
+      <w:bookmarkEnd w:id="28"/>
     </w:p>
     <w:p>
       <w:pPr>
@@ -18254,7 +19357,7 @@
         <w:rPr>
           <w:b/>
         </w:rPr>
-        <w:t>94 Rust tests</w:t>
+        <w:t>105 Rust tests</w:t>
       </w:r>
       <w:r>
         <w:t xml:space="preserve"> (</w:t>
@@ -18381,7 +19484,26 @@
         <w:t>fuzz test</w:t>
       </w:r>
       <w:r>
-        <w:t xml:space="preserve"> pushing 3,000 random frames through every link type.</w:t>
+        <w:t xml:space="preserve"> pushing 3,000 random frames through every link type;</w:t>
+      </w:r>
+    </w:p>
+    <w:p>
+      <w:pPr>
+        <w:pStyle w:val="ListBullet2"/>
+      </w:pPr>
+      <w:r>
+        <w:t xml:space="preserve">App Launchers: folder scan of a synthetic bundle (ELF vs library detection, scripts, libs, Qt plugins, icons), Exec quoting rules, desktop-file validation, spec rejection, icon conversion, dock favourites parsing. </w:t>
+      </w:r>
+      <w:r>
+        <w:rPr>
+          <w:rFonts w:ascii="Consolas" w:hAnsi="Consolas"/>
+          <w:sz w:val="19"/>
+          <w:shd w:val="clear" w:fill="EEF1F5"/>
+        </w:rPr>
+        <w:t>examples/launcher_selftest.rs</w:t>
+      </w:r>
+      <w:r>
+        <w:t xml:space="preserve"> installs a real launcher for the current user (menu, trusted desktop icon, dock), verifies it and removes it again.</w:t>
       </w:r>
     </w:p>
     <w:p>
@@ -18437,14 +19559,14 @@
       </w:r>
     </w:p>
     <w:p>
-      <w:bookmarkStart w:id="28" w:name="sec28"/>
+      <w:bookmarkStart w:id="29" w:name="sec29"/>
       <w:pPr>
         <w:pStyle w:val="Heading1"/>
       </w:pPr>
       <w:r>
         <w:t>15. Packaging</w:t>
       </w:r>
-      <w:bookmarkEnd w:id="28"/>
+      <w:bookmarkEnd w:id="29"/>
     </w:p>
     <w:p>
       <w:pPr>
@@ -18533,7 +19655,7 @@
         <w:t>/usr/bin/syspulse-capture</w:t>
       </w:r>
       <w:r>
-        <w:t xml:space="preserve">, the polkit policy, the desktop file and icons. It depends on WebKitGTK, AppIndicator, polkit, pciutils, usbutils, apt, x11-utils, x11-xserver-utils, pulseaudio-utils, libpcap0.8 and the GStreamer plugin packages (see </w:t>
+        <w:t xml:space="preserve">, the polkit policy, the desktop file and icons. It depends on WebKitGTK, AppIndicator, polkit, pciutils, usbutils, apt, x11-utils, x11-xserver-utils, pulseaudio-utils, libpcap0.8, acl, desktop-file-utils and the GStreamer plugin packages (see </w:t>
       </w:r>
       <w:r>
         <w:t>the “SysPulse Installation Guide”</w:t>
@@ -18571,14 +19693,14 @@
       </w:r>
     </w:p>
     <w:p>
-      <w:bookmarkStart w:id="29" w:name="sec29"/>
+      <w:bookmarkStart w:id="30" w:name="sec30"/>
       <w:pPr>
         <w:pStyle w:val="Heading1"/>
       </w:pPr>
       <w:r>
         <w:t>16. Platform scope</w:t>
       </w:r>
-      <w:bookmarkEnd w:id="29"/>
+      <w:bookmarkEnd w:id="30"/>
     </w:p>
     <w:p>
       <w:r>
@@ -18753,14 +19875,14 @@
       </w:r>
     </w:p>
     <w:p>
-      <w:bookmarkStart w:id="30" w:name="sec30"/>
+      <w:bookmarkStart w:id="31" w:name="sec31"/>
       <w:pPr>
         <w:pStyle w:val="Heading1"/>
       </w:pPr>
       <w:r>
         <w:t>17. Known limitations</w:t>
       </w:r>
-      <w:bookmarkEnd w:id="30"/>
+      <w:bookmarkEnd w:id="31"/>
     </w:p>
     <w:p>
       <w:pPr>
@@ -18811,14 +19933,14 @@
       </w:r>
     </w:p>
     <w:p>
-      <w:bookmarkStart w:id="31" w:name="sec31"/>
+      <w:bookmarkStart w:id="32" w:name="sec32"/>
       <w:pPr>
         <w:pStyle w:val="Heading1"/>
       </w:pPr>
       <w:r>
         <w:t>18. Coding conventions</w:t>
       </w:r>
-      <w:bookmarkEnd w:id="31"/>
+      <w:bookmarkEnd w:id="32"/>
     </w:p>
     <w:p>
       <w:pPr>

</xml_diff>

<commit_message>
Hide the screen recorder in public releases (feature switch); version 0.7.1
Co-Authored-By: Claude Opus 5.5 <noreply@anthropic.com>
</commit_message>
<xml_diff>
--- a/docs/word/SysPulse Architecture Guide.docx
+++ b/docs/word/SysPulse Architecture Guide.docx
@@ -101,7 +101,7 @@
           <w:b/>
           <w:sz w:val="21"/>
         </w:rPr>
-        <w:t>0.7.0</w:t>
+        <w:t>0.7.1</w:t>
       </w:r>
     </w:p>
     <w:p>
@@ -120,7 +120,7 @@
           <w:b/>
           <w:sz w:val="21"/>
         </w:rPr>
-        <w:t>12 October 2026</w:t>
+        <w:t>24 October 2026</w:t>
       </w:r>
     </w:p>
     <w:p>
@@ -8303,6 +8303,100 @@
         <w:t>)</w:t>
       </w:r>
       <w:bookmarkEnd w:id="11"/>
+    </w:p>
+    <w:tbl>
+      <w:tblPr>
+        <w:tblW w:type="auto" w:w="0"/>
+        <w:tblLook w:firstColumn="1" w:firstRow="1" w:lastColumn="0" w:lastRow="0" w:noHBand="0" w:noVBand="1" w:val="04A0"/>
+      </w:tblPr>
+      <w:tblGrid>
+        <w:gridCol w:w="9638"/>
+      </w:tblGrid>
+      <w:tr>
+        <w:tc>
+          <w:tcPr>
+            <w:tcW w:type="dxa" w:w="9638"/>
+            <w:shd w:val="clear" w:color="auto" w:fill="EAF2FF"/>
+            <w:tcMar>
+              <w:top w:w="100" w:type="dxa"/>
+              <w:bottom w:w="100" w:type="dxa"/>
+              <w:start w:w="160" w:type="dxa"/>
+              <w:end w:w="160" w:type="dxa"/>
+            </w:tcMar>
+          </w:tcPr>
+          <w:p>
+            <w:r>
+              <w:rPr>
+                <w:b/>
+              </w:rPr>
+              <w:t>Hidden in public releases.</w:t>
+            </w:r>
+            <w:r>
+              <w:t xml:space="preserve"> </w:t>
+            </w:r>
+            <w:r>
+              <w:rPr>
+                <w:rFonts w:ascii="Consolas" w:hAnsi="Consolas"/>
+                <w:sz w:val="19"/>
+                <w:shd w:val="clear" w:fill="EEF1F5"/>
+              </w:rPr>
+              <w:t>recorder::ENABLED</w:t>
+            </w:r>
+            <w:r>
+              <w:t xml:space="preserve"> (src-tauri/src/recorder.rs) and </w:t>
+            </w:r>
+            <w:r>
+              <w:rPr>
+                <w:rFonts w:ascii="Consolas" w:hAnsi="Consolas"/>
+                <w:sz w:val="19"/>
+                <w:shd w:val="clear" w:fill="EEF1F5"/>
+              </w:rPr>
+              <w:t>FEATURES.recorder</w:t>
+            </w:r>
+            <w:r>
+              <w:t xml:space="preserve"> (ui/src/lib/features.ts) are </w:t>
+            </w:r>
+            <w:r>
+              <w:rPr>
+                <w:rFonts w:ascii="Consolas" w:hAnsi="Consolas"/>
+                <w:sz w:val="19"/>
+                <w:shd w:val="clear" w:fill="EEF1F5"/>
+              </w:rPr>
+              <w:t>false</w:t>
+            </w:r>
+            <w:r>
+              <w:t xml:space="preserve">: no sidebar entry, no tray icon, no global hotkeys, and </w:t>
+            </w:r>
+            <w:r>
+              <w:rPr>
+                <w:rFonts w:ascii="Consolas" w:hAnsi="Consolas"/>
+                <w:sz w:val="19"/>
+                <w:shd w:val="clear" w:fill="EEF1F5"/>
+              </w:rPr>
+              <w:t>rec_start</w:t>
+            </w:r>
+            <w:r>
+              <w:t xml:space="preserve"> refuses. The code stays in the repository; set both to </w:t>
+            </w:r>
+            <w:r>
+              <w:rPr>
+                <w:rFonts w:ascii="Consolas" w:hAnsi="Consolas"/>
+                <w:sz w:val="19"/>
+                <w:shd w:val="clear" w:fill="EEF1F5"/>
+              </w:rPr>
+              <w:t>true</w:t>
+            </w:r>
+            <w:r>
+              <w:t xml:space="preserve"> to enable it.</w:t>
+            </w:r>
+          </w:p>
+        </w:tc>
+      </w:tr>
+    </w:tbl>
+    <w:p>
+      <w:pPr>
+        <w:spacing w:after="0"/>
+      </w:pPr>
     </w:p>
     <w:tbl>
       <w:tblPr>

</xml_diff>